<commit_message>
final update of the code as gotten result from one AI system.
</commit_message>
<xml_diff>
--- a/docs/Global South AI Safety hackathon submission.docx
+++ b/docs/Global South AI Safety hackathon submission.docx
@@ -1400,6 +1400,33 @@
     </w:p>
     <w:p>
       <w:pPr>
+        <w:rPr>
+          <w:rFonts w:ascii="Old Standard TT" w:eastAsia="Old Standard TT" w:hAnsi="Old Standard TT" w:cs="Old Standard TT"/>
+          <w:i/>
+          <w:iCs/>
+        </w:rPr>
+      </w:pPr>
+    </w:p>
+    <w:p>
+      <w:pPr>
+        <w:rPr>
+          <w:rFonts w:ascii="Old Standard TT" w:eastAsia="Old Standard TT" w:hAnsi="Old Standard TT" w:cs="Old Standard TT"/>
+          <w:i/>
+          <w:iCs/>
+        </w:rPr>
+      </w:pPr>
+    </w:p>
+    <w:p>
+      <w:pPr>
+        <w:rPr>
+          <w:rFonts w:ascii="Old Standard TT" w:eastAsia="Old Standard TT" w:hAnsi="Old Standard TT" w:cs="Old Standard TT"/>
+          <w:i/>
+          <w:iCs/>
+        </w:rPr>
+      </w:pPr>
+    </w:p>
+    <w:p>
+      <w:pPr>
         <w:pStyle w:val="Heading2"/>
         <w:spacing w:before="200" w:after="0" w:line="360" w:lineRule="auto"/>
         <w:rPr>
@@ -1422,18 +1449,73 @@
           <w:sz w:val="28"/>
           <w:szCs w:val="28"/>
         </w:rPr>
+        <w:lastRenderedPageBreak/>
         <w:t>3. Methods</w:t>
       </w:r>
     </w:p>
     <w:p>
       <w:pPr>
+        <w:pStyle w:val="Heading4"/>
+      </w:pPr>
+      <w:r>
+        <w:t>3.1 System Architecture</w:t>
+      </w:r>
+    </w:p>
+    <w:p>
+      <w:pPr>
         <w:spacing w:after="160" w:line="259" w:lineRule="auto"/>
+        <w:rPr>
+          <w:rFonts w:ascii="Old Standard TT" w:hAnsi="Old Standard TT"/>
+        </w:rPr>
+      </w:pPr>
+      <w:r>
+        <w:rPr>
+          <w:rFonts w:ascii="Old Standard TT" w:hAnsi="Old Standard TT"/>
+        </w:rPr>
+        <w:t>The platform consists of two components:</w:t>
+      </w:r>
+    </w:p>
+    <w:p>
+      <w:pPr>
+        <w:spacing w:after="160" w:line="259" w:lineRule="auto"/>
+        <w:rPr>
+          <w:rFonts w:ascii="Old Standard TT" w:hAnsi="Old Standard TT"/>
+        </w:rPr>
+      </w:pPr>
+      <w:r>
         <w:rPr>
           <w:rFonts w:ascii="Old Standard TT" w:hAnsi="Old Standard TT"/>
           <w:b/>
           <w:bCs/>
-          <w:sz w:val="24"/>
-          <w:szCs w:val="24"/>
+        </w:rPr>
+        <w:t>Backend (Node.js / Express):</w:t>
+      </w:r>
+      <w:r>
+        <w:rPr>
+          <w:rFonts w:ascii="Old Standard TT" w:hAnsi="Old Standard TT"/>
+        </w:rPr>
+        <w:t xml:space="preserve"> A modular API with six route layers — chat, interactions, metrics, analyze, and benchmark. The benchmark module runs adversarial prompts through any connected provider and returns per-prompt and aggregate results. Providers (Gemini, OpenAI, Anthropic) are swappable via a factory pattern; a </w:t>
+      </w:r>
+      <w:proofErr w:type="spellStart"/>
+      <w:r>
+        <w:rPr>
+          <w:rFonts w:ascii="Old Standard TT" w:hAnsi="Old Standard TT"/>
+        </w:rPr>
+        <w:t>LocalProvider</w:t>
+      </w:r>
+      <w:proofErr w:type="spellEnd"/>
+      <w:r>
+        <w:rPr>
+          <w:rFonts w:ascii="Old Standard TT" w:hAnsi="Old Standard TT"/>
+        </w:rPr>
+        <w:t xml:space="preserve"> offers fully offline evaluation using rule-based simulated responses.</w:t>
+      </w:r>
+    </w:p>
+    <w:p>
+      <w:pPr>
+        <w:spacing w:after="160" w:line="259" w:lineRule="auto"/>
+        <w:rPr>
+          <w:rFonts w:ascii="Old Standard TT" w:hAnsi="Old Standard TT"/>
         </w:rPr>
       </w:pPr>
       <w:r>
@@ -1441,118 +1523,35 @@
           <w:rFonts w:ascii="Old Standard TT" w:hAnsi="Old Standard TT"/>
           <w:b/>
           <w:bCs/>
-          <w:sz w:val="24"/>
-          <w:szCs w:val="24"/>
-        </w:rPr>
-        <w:t>3.1 System Architecture</w:t>
-      </w:r>
-    </w:p>
-    <w:p>
-      <w:pPr>
-        <w:spacing w:after="160" w:line="259" w:lineRule="auto"/>
-        <w:rPr>
-          <w:rFonts w:ascii="Old Standard TT" w:hAnsi="Old Standard TT"/>
-        </w:rPr>
-      </w:pPr>
-      <w:r>
-        <w:rPr>
-          <w:rFonts w:ascii="Old Standard TT" w:hAnsi="Old Standard TT"/>
-        </w:rPr>
-        <w:t>The platform consists of two components:</w:t>
-      </w:r>
-    </w:p>
-    <w:p>
-      <w:pPr>
-        <w:spacing w:after="160" w:line="259" w:lineRule="auto"/>
-        <w:rPr>
-          <w:rFonts w:ascii="Old Standard TT" w:hAnsi="Old Standard TT"/>
-        </w:rPr>
-      </w:pPr>
-      <w:r>
-        <w:rPr>
-          <w:rFonts w:ascii="Old Standard TT" w:hAnsi="Old Standard TT"/>
-          <w:b/>
-          <w:bCs/>
-        </w:rPr>
-        <w:lastRenderedPageBreak/>
-        <w:t>Backend (Node.js / Express):</w:t>
-      </w:r>
-      <w:r>
-        <w:rPr>
-          <w:rFonts w:ascii="Old Standard TT" w:hAnsi="Old Standard TT"/>
-        </w:rPr>
-        <w:t xml:space="preserve"> A modular API with six route layers — chat, interactions, metrics, analyze, and benchmark. The benchmark module runs adversarial prompts through any connected provider and returns per-prompt and aggregate results. Providers (Gemini, OpenAI, Anthropic) are swappable via a factory pattern; a </w:t>
+        </w:rPr>
+        <w:t>Frontend (React / TypeScript):</w:t>
+      </w:r>
+      <w:r>
+        <w:rPr>
+          <w:rFonts w:ascii="Old Standard TT" w:hAnsi="Old Standard TT"/>
+        </w:rPr>
+        <w:t xml:space="preserve"> A six-tab dashboard — Overview, Prompt Explorer, Model Comparison (with </w:t>
       </w:r>
       <w:proofErr w:type="spellStart"/>
       <w:r>
         <w:rPr>
           <w:rFonts w:ascii="Old Standard TT" w:hAnsi="Old Standard TT"/>
         </w:rPr>
-        <w:t>LocalProvider</w:t>
+        <w:t>HarmBench</w:t>
       </w:r>
       <w:proofErr w:type="spellEnd"/>
       <w:r>
         <w:rPr>
           <w:rFonts w:ascii="Old Standard TT" w:hAnsi="Old Standard TT"/>
         </w:rPr>
-        <w:t xml:space="preserve"> offers fully offline evaluation using rule-based simulated responses.</w:t>
-      </w:r>
-    </w:p>
-    <w:p>
-      <w:pPr>
-        <w:spacing w:after="160" w:line="259" w:lineRule="auto"/>
-        <w:rPr>
-          <w:rFonts w:ascii="Old Standard TT" w:hAnsi="Old Standard TT"/>
-        </w:rPr>
-      </w:pPr>
-      <w:r>
-        <w:rPr>
-          <w:rFonts w:ascii="Old Standard TT" w:hAnsi="Old Standard TT"/>
-          <w:b/>
-          <w:bCs/>
-        </w:rPr>
-        <w:t>Frontend (React / TypeScript):</w:t>
-      </w:r>
-      <w:r>
-        <w:rPr>
-          <w:rFonts w:ascii="Old Standard TT" w:hAnsi="Old Standard TT"/>
-        </w:rPr>
-        <w:t xml:space="preserve"> A six-tab dashboard — Overview, Prompt Explorer, Model Comparison (with </w:t>
-      </w:r>
-      <w:proofErr w:type="spellStart"/>
-      <w:r>
-        <w:rPr>
-          <w:rFonts w:ascii="Old Standard TT" w:hAnsi="Old Standard TT"/>
-        </w:rPr>
-        <w:t>HarmBench</w:t>
-      </w:r>
-      <w:proofErr w:type="spellEnd"/>
-      <w:r>
-        <w:rPr>
-          <w:rFonts w:ascii="Old Standard TT" w:hAnsi="Old Standard TT"/>
-        </w:rPr>
         <w:t xml:space="preserve"> runner), Live Analyzer, Language Safety, and Jailbreak Monitor. All tabs derive from a single interactions state array fetched from the API.</w:t>
       </w:r>
     </w:p>
     <w:p>
       <w:pPr>
-        <w:spacing w:after="160" w:line="259" w:lineRule="auto"/>
-        <w:rPr>
-          <w:rFonts w:ascii="Old Standard TT" w:hAnsi="Old Standard TT"/>
-          <w:b/>
-          <w:bCs/>
-          <w:sz w:val="24"/>
-          <w:szCs w:val="24"/>
-        </w:rPr>
-      </w:pPr>
-      <w:r>
-        <w:rPr>
-          <w:rFonts w:ascii="Old Standard TT" w:hAnsi="Old Standard TT"/>
-          <w:b/>
-          <w:bCs/>
-          <w:sz w:val="24"/>
-          <w:szCs w:val="24"/>
-        </w:rPr>
+        <w:pStyle w:val="Heading4"/>
+      </w:pPr>
+      <w:r>
         <w:t>3.2 Benchmark Dataset</w:t>
       </w:r>
     </w:p>
@@ -2415,23 +2414,9 @@
     </w:p>
     <w:p>
       <w:pPr>
-        <w:spacing w:after="160" w:line="259" w:lineRule="auto"/>
-        <w:rPr>
-          <w:rFonts w:ascii="Old Standard TT" w:hAnsi="Old Standard TT"/>
-          <w:b/>
-          <w:bCs/>
-          <w:sz w:val="24"/>
-          <w:szCs w:val="24"/>
-        </w:rPr>
-      </w:pPr>
-      <w:r>
-        <w:rPr>
-          <w:rFonts w:ascii="Old Standard TT" w:hAnsi="Old Standard TT"/>
-          <w:b/>
-          <w:bCs/>
-          <w:sz w:val="24"/>
-          <w:szCs w:val="24"/>
-        </w:rPr>
+        <w:pStyle w:val="Heading4"/>
+      </w:pPr>
+      <w:r>
         <w:t>3.3 Refusal Detection</w:t>
       </w:r>
     </w:p>
@@ -2534,6 +2519,7 @@
           <w:b/>
           <w:bCs/>
         </w:rPr>
+        <w:lastRenderedPageBreak/>
         <w:t>Swahili:</w:t>
       </w:r>
       <w:r>
@@ -2760,7 +2746,6 @@
           <w:b/>
           <w:bCs/>
         </w:rPr>
-        <w:lastRenderedPageBreak/>
         <w:t>isiZulu:</w:t>
       </w:r>
       <w:r>
@@ -2884,23 +2869,9 @@
     </w:p>
     <w:p>
       <w:pPr>
-        <w:spacing w:after="160" w:line="259" w:lineRule="auto"/>
-        <w:rPr>
-          <w:rFonts w:ascii="Old Standard TT" w:hAnsi="Old Standard TT"/>
-          <w:b/>
-          <w:bCs/>
-          <w:sz w:val="24"/>
-          <w:szCs w:val="24"/>
-        </w:rPr>
-      </w:pPr>
-      <w:r>
-        <w:rPr>
-          <w:rFonts w:ascii="Old Standard TT" w:hAnsi="Old Standard TT"/>
-          <w:b/>
-          <w:bCs/>
-          <w:sz w:val="24"/>
-          <w:szCs w:val="24"/>
-        </w:rPr>
+        <w:pStyle w:val="Heading4"/>
+      </w:pPr>
+      <w:r>
         <w:t>3.4 Scoring</w:t>
       </w:r>
     </w:p>
@@ -3070,23 +3041,9 @@
     </w:p>
     <w:p>
       <w:pPr>
-        <w:spacing w:after="160" w:line="259" w:lineRule="auto"/>
-        <w:rPr>
-          <w:rFonts w:ascii="Old Standard TT" w:hAnsi="Old Standard TT"/>
-          <w:b/>
-          <w:bCs/>
-          <w:sz w:val="24"/>
-          <w:szCs w:val="24"/>
-        </w:rPr>
-      </w:pPr>
-      <w:r>
-        <w:rPr>
-          <w:rFonts w:ascii="Old Standard TT" w:hAnsi="Old Standard TT"/>
-          <w:b/>
-          <w:bCs/>
-          <w:sz w:val="24"/>
-          <w:szCs w:val="24"/>
-        </w:rPr>
+        <w:pStyle w:val="Heading4"/>
+      </w:pPr>
+      <w:r>
         <w:t>3.5 Risk Engine</w:t>
       </w:r>
     </w:p>
@@ -3173,7 +3130,7 @@
     </w:p>
     <w:tbl>
       <w:tblPr>
-        <w:tblW w:w="0" w:type="auto"/>
+        <w:tblW w:w="7702" w:type="dxa"/>
         <w:tblBorders>
           <w:top w:val="single" w:sz="4" w:space="0" w:color="auto"/>
           <w:left w:val="single" w:sz="4" w:space="0" w:color="auto"/>
@@ -3190,14 +3147,15 @@
         <w:tblLook w:val="04A0" w:firstRow="1" w:lastRow="0" w:firstColumn="1" w:lastColumn="0" w:noHBand="0" w:noVBand="1"/>
       </w:tblPr>
       <w:tblGrid>
-        <w:gridCol w:w="1573"/>
-        <w:gridCol w:w="2074"/>
-        <w:gridCol w:w="1836"/>
-        <w:gridCol w:w="2239"/>
-        <w:gridCol w:w="1628"/>
+        <w:gridCol w:w="1400"/>
+        <w:gridCol w:w="1782"/>
+        <w:gridCol w:w="1546"/>
+        <w:gridCol w:w="1341"/>
+        <w:gridCol w:w="1633"/>
       </w:tblGrid>
       <w:tr>
         <w:trPr>
+          <w:trHeight w:val="790"/>
           <w:tblHeader/>
         </w:trPr>
         <w:tc>
@@ -3230,10 +3188,12 @@
             </w:pPr>
             <w:r>
               <w:rPr>
-                <w:rFonts w:ascii="Old Standard TT" w:eastAsia="Old Standard TT" w:hAnsi="Old Standard TT" w:cs="Old Standard TT"/>
+                <w:rFonts w:ascii="Segoe UI" w:hAnsi="Segoe UI" w:cs="Segoe UI"/>
                 <w:b/>
                 <w:bCs/>
-                <w:lang w:val="en-ZA"/>
+                <w:color w:val="CCCCCC"/>
+                <w:sz w:val="20"/>
+                <w:szCs w:val="20"/>
               </w:rPr>
               <w:t>Model</w:t>
             </w:r>
@@ -3269,10 +3229,12 @@
             </w:pPr>
             <w:r>
               <w:rPr>
-                <w:rFonts w:ascii="Old Standard TT" w:eastAsia="Old Standard TT" w:hAnsi="Old Standard TT" w:cs="Old Standard TT"/>
+                <w:rFonts w:ascii="Segoe UI" w:hAnsi="Segoe UI" w:cs="Segoe UI"/>
                 <w:b/>
                 <w:bCs/>
-                <w:lang w:val="en-ZA"/>
+                <w:color w:val="CCCCCC"/>
+                <w:sz w:val="20"/>
+                <w:szCs w:val="20"/>
               </w:rPr>
               <w:t>Refusal Rate (harmful)</w:t>
             </w:r>
@@ -3308,12 +3270,139 @@
             </w:pPr>
             <w:r>
               <w:rPr>
+                <w:rFonts w:ascii="Segoe UI" w:hAnsi="Segoe UI" w:cs="Segoe UI"/>
+                <w:b/>
+                <w:bCs/>
+                <w:color w:val="CCCCCC"/>
+                <w:sz w:val="20"/>
+                <w:szCs w:val="20"/>
+              </w:rPr>
+              <w:t>Attack Success Rate</w:t>
+            </w:r>
+          </w:p>
+        </w:tc>
+        <w:tc>
+          <w:tcPr>
+            <w:tcW w:w="1341" w:type="dxa"/>
+            <w:tcBorders>
+              <w:top w:val="single" w:sz="4" w:space="0" w:color="auto"/>
+              <w:left w:val="single" w:sz="4" w:space="0" w:color="auto"/>
+              <w:bottom w:val="single" w:sz="4" w:space="0" w:color="auto"/>
+              <w:right w:val="single" w:sz="4" w:space="0" w:color="auto"/>
+            </w:tcBorders>
+            <w:shd w:val="clear" w:color="auto" w:fill="181818"/>
+            <w:tcMar>
+              <w:top w:w="30" w:type="dxa"/>
+              <w:left w:w="30" w:type="dxa"/>
+              <w:bottom w:w="30" w:type="dxa"/>
+              <w:right w:w="30" w:type="dxa"/>
+            </w:tcMar>
+            <w:vAlign w:val="center"/>
+            <w:hideMark/>
+          </w:tcPr>
+          <w:p>
+            <w:pPr>
+              <w:rPr>
                 <w:rFonts w:ascii="Old Standard TT" w:eastAsia="Old Standard TT" w:hAnsi="Old Standard TT" w:cs="Old Standard TT"/>
                 <w:b/>
                 <w:bCs/>
                 <w:lang w:val="en-ZA"/>
               </w:rPr>
-              <w:t>Attack Success Rate</w:t>
+            </w:pPr>
+            <w:r>
+              <w:rPr>
+                <w:rFonts w:ascii="Segoe UI" w:hAnsi="Segoe UI" w:cs="Segoe UI"/>
+                <w:b/>
+                <w:bCs/>
+                <w:color w:val="CCCCCC"/>
+                <w:sz w:val="20"/>
+                <w:szCs w:val="20"/>
+              </w:rPr>
+              <w:t>Safe Control Compliance</w:t>
+            </w:r>
+          </w:p>
+        </w:tc>
+        <w:tc>
+          <w:tcPr>
+            <w:tcW w:w="1633" w:type="dxa"/>
+            <w:tcBorders>
+              <w:top w:val="single" w:sz="4" w:space="0" w:color="auto"/>
+              <w:left w:val="single" w:sz="4" w:space="0" w:color="auto"/>
+              <w:bottom w:val="single" w:sz="4" w:space="0" w:color="auto"/>
+              <w:right w:val="single" w:sz="4" w:space="0" w:color="auto"/>
+            </w:tcBorders>
+            <w:shd w:val="clear" w:color="auto" w:fill="181818"/>
+            <w:tcMar>
+              <w:top w:w="30" w:type="dxa"/>
+              <w:left w:w="30" w:type="dxa"/>
+              <w:bottom w:w="30" w:type="dxa"/>
+              <w:right w:w="30" w:type="dxa"/>
+            </w:tcMar>
+            <w:vAlign w:val="center"/>
+            <w:hideMark/>
+          </w:tcPr>
+          <w:p>
+            <w:pPr>
+              <w:rPr>
+                <w:rFonts w:ascii="Old Standard TT" w:eastAsia="Old Standard TT" w:hAnsi="Old Standard TT" w:cs="Old Standard TT"/>
+                <w:b/>
+                <w:bCs/>
+                <w:lang w:val="en-ZA"/>
+              </w:rPr>
+            </w:pPr>
+            <w:r>
+              <w:rPr>
+                <w:rFonts w:ascii="Segoe UI" w:hAnsi="Segoe UI" w:cs="Segoe UI"/>
+                <w:b/>
+                <w:bCs/>
+                <w:color w:val="CCCCCC"/>
+                <w:sz w:val="20"/>
+                <w:szCs w:val="20"/>
+              </w:rPr>
+              <w:t>Overall Pass Rate</w:t>
+            </w:r>
+          </w:p>
+        </w:tc>
+      </w:tr>
+      <w:tr>
+        <w:trPr>
+          <w:trHeight w:val="387"/>
+        </w:trPr>
+        <w:tc>
+          <w:tcPr>
+            <w:tcW w:w="0" w:type="auto"/>
+            <w:tcBorders>
+              <w:top w:val="single" w:sz="4" w:space="0" w:color="auto"/>
+              <w:left w:val="single" w:sz="4" w:space="0" w:color="auto"/>
+              <w:bottom w:val="single" w:sz="4" w:space="0" w:color="auto"/>
+              <w:right w:val="single" w:sz="4" w:space="0" w:color="auto"/>
+            </w:tcBorders>
+            <w:shd w:val="clear" w:color="auto" w:fill="181818"/>
+            <w:tcMar>
+              <w:top w:w="30" w:type="dxa"/>
+              <w:left w:w="30" w:type="dxa"/>
+              <w:bottom w:w="30" w:type="dxa"/>
+              <w:right w:w="30" w:type="dxa"/>
+            </w:tcMar>
+            <w:vAlign w:val="center"/>
+            <w:hideMark/>
+          </w:tcPr>
+          <w:p>
+            <w:pPr>
+              <w:rPr>
+                <w:rFonts w:ascii="Old Standard TT" w:eastAsia="Old Standard TT" w:hAnsi="Old Standard TT" w:cs="Old Standard TT"/>
+                <w:lang w:val="en-ZA"/>
+              </w:rPr>
+            </w:pPr>
+            <w:r>
+              <w:rPr>
+                <w:rStyle w:val="Strong"/>
+                <w:rFonts w:ascii="Segoe UI" w:hAnsi="Segoe UI" w:cs="Segoe UI"/>
+                <w:color w:val="CCCCCC"/>
+                <w:sz w:val="20"/>
+                <w:szCs w:val="20"/>
+              </w:rPr>
+              <w:t>Gemini 2.0 Flash</w:t>
             </w:r>
           </w:p>
         </w:tc>
@@ -3340,19 +3429,18 @@
             <w:pPr>
               <w:rPr>
                 <w:rFonts w:ascii="Old Standard TT" w:eastAsia="Old Standard TT" w:hAnsi="Old Standard TT" w:cs="Old Standard TT"/>
-                <w:b/>
-                <w:bCs/>
                 <w:lang w:val="en-ZA"/>
               </w:rPr>
             </w:pPr>
             <w:r>
               <w:rPr>
-                <w:rFonts w:ascii="Old Standard TT" w:eastAsia="Old Standard TT" w:hAnsi="Old Standard TT" w:cs="Old Standard TT"/>
-                <w:b/>
-                <w:bCs/>
-                <w:lang w:val="en-ZA"/>
-              </w:rPr>
-              <w:t>Safe Control Compliance</w:t>
+                <w:rStyle w:val="Strong"/>
+                <w:rFonts w:ascii="Segoe UI" w:hAnsi="Segoe UI" w:cs="Segoe UI"/>
+                <w:color w:val="CCCCCC"/>
+                <w:sz w:val="20"/>
+                <w:szCs w:val="20"/>
+              </w:rPr>
+              <w:t>100%</w:t>
             </w:r>
           </w:p>
         </w:tc>
@@ -3379,24 +3467,102 @@
             <w:pPr>
               <w:rPr>
                 <w:rFonts w:ascii="Old Standard TT" w:eastAsia="Old Standard TT" w:hAnsi="Old Standard TT" w:cs="Old Standard TT"/>
-                <w:b/>
-                <w:bCs/>
                 <w:lang w:val="en-ZA"/>
               </w:rPr>
             </w:pPr>
             <w:r>
               <w:rPr>
+                <w:rStyle w:val="Strong"/>
+                <w:rFonts w:ascii="Segoe UI" w:hAnsi="Segoe UI" w:cs="Segoe UI"/>
+                <w:color w:val="CCCCCC"/>
+                <w:sz w:val="20"/>
+                <w:szCs w:val="20"/>
+              </w:rPr>
+              <w:t>0%</w:t>
+            </w:r>
+          </w:p>
+        </w:tc>
+        <w:tc>
+          <w:tcPr>
+            <w:tcW w:w="1341" w:type="dxa"/>
+            <w:tcBorders>
+              <w:top w:val="single" w:sz="4" w:space="0" w:color="auto"/>
+              <w:left w:val="single" w:sz="4" w:space="0" w:color="auto"/>
+              <w:bottom w:val="single" w:sz="4" w:space="0" w:color="auto"/>
+              <w:right w:val="single" w:sz="4" w:space="0" w:color="auto"/>
+            </w:tcBorders>
+            <w:shd w:val="clear" w:color="auto" w:fill="181818"/>
+            <w:tcMar>
+              <w:top w:w="30" w:type="dxa"/>
+              <w:left w:w="30" w:type="dxa"/>
+              <w:bottom w:w="30" w:type="dxa"/>
+              <w:right w:w="30" w:type="dxa"/>
+            </w:tcMar>
+            <w:vAlign w:val="center"/>
+            <w:hideMark/>
+          </w:tcPr>
+          <w:p>
+            <w:pPr>
+              <w:rPr>
                 <w:rFonts w:ascii="Old Standard TT" w:eastAsia="Old Standard TT" w:hAnsi="Old Standard TT" w:cs="Old Standard TT"/>
-                <w:b/>
-                <w:bCs/>
                 <w:lang w:val="en-ZA"/>
               </w:rPr>
-              <w:t>Overall Pass Rate</w:t>
+            </w:pPr>
+            <w:r>
+              <w:rPr>
+                <w:rStyle w:val="Strong"/>
+                <w:rFonts w:ascii="Segoe UI" w:hAnsi="Segoe UI" w:cs="Segoe UI"/>
+                <w:color w:val="CCCCCC"/>
+                <w:sz w:val="20"/>
+                <w:szCs w:val="20"/>
+              </w:rPr>
+              <w:t>100%</w:t>
+            </w:r>
+          </w:p>
+        </w:tc>
+        <w:tc>
+          <w:tcPr>
+            <w:tcW w:w="1633" w:type="dxa"/>
+            <w:tcBorders>
+              <w:top w:val="single" w:sz="4" w:space="0" w:color="auto"/>
+              <w:left w:val="single" w:sz="4" w:space="0" w:color="auto"/>
+              <w:bottom w:val="single" w:sz="4" w:space="0" w:color="auto"/>
+              <w:right w:val="single" w:sz="4" w:space="0" w:color="auto"/>
+            </w:tcBorders>
+            <w:shd w:val="clear" w:color="auto" w:fill="181818"/>
+            <w:tcMar>
+              <w:top w:w="30" w:type="dxa"/>
+              <w:left w:w="30" w:type="dxa"/>
+              <w:bottom w:w="30" w:type="dxa"/>
+              <w:right w:w="30" w:type="dxa"/>
+            </w:tcMar>
+            <w:vAlign w:val="center"/>
+            <w:hideMark/>
+          </w:tcPr>
+          <w:p>
+            <w:pPr>
+              <w:rPr>
+                <w:rFonts w:ascii="Old Standard TT" w:eastAsia="Old Standard TT" w:hAnsi="Old Standard TT" w:cs="Old Standard TT"/>
+                <w:lang w:val="en-ZA"/>
+              </w:rPr>
+            </w:pPr>
+            <w:r>
+              <w:rPr>
+                <w:rStyle w:val="Strong"/>
+                <w:rFonts w:ascii="Segoe UI" w:hAnsi="Segoe UI" w:cs="Segoe UI"/>
+                <w:color w:val="CCCCCC"/>
+                <w:sz w:val="20"/>
+                <w:szCs w:val="20"/>
+              </w:rPr>
+              <w:t>100%</w:t>
             </w:r>
           </w:p>
         </w:tc>
       </w:tr>
       <w:tr>
+        <w:trPr>
+          <w:trHeight w:val="387"/>
+        </w:trPr>
         <w:tc>
           <w:tcPr>
             <w:tcW w:w="0" w:type="auto"/>
@@ -3425,10 +3591,12 @@
             </w:pPr>
             <w:r>
               <w:rPr>
-                <w:rFonts w:ascii="Old Standard TT" w:eastAsia="Old Standard TT" w:hAnsi="Old Standard TT" w:cs="Old Standard TT"/>
-                <w:lang w:val="en-ZA"/>
-              </w:rPr>
-              <w:t>Gemini 2.0 Flash</w:t>
+                <w:rFonts w:ascii="Segoe UI" w:hAnsi="Segoe UI" w:cs="Segoe UI"/>
+                <w:color w:val="CCCCCC"/>
+                <w:sz w:val="20"/>
+                <w:szCs w:val="20"/>
+              </w:rPr>
+              <w:t>GPT-4o-mini</w:t>
             </w:r>
           </w:p>
         </w:tc>
@@ -3460,10 +3628,12 @@
             </w:pPr>
             <w:r>
               <w:rPr>
-                <w:rFonts w:ascii="Old Standard TT" w:eastAsia="Old Standard TT" w:hAnsi="Old Standard TT" w:cs="Old Standard TT"/>
-                <w:lang w:val="en-ZA"/>
-              </w:rPr>
-              <w:t>[X]%</w:t>
+                <w:rFonts w:ascii="Segoe UI" w:hAnsi="Segoe UI" w:cs="Segoe UI"/>
+                <w:color w:val="CCCCCC"/>
+                <w:sz w:val="20"/>
+                <w:szCs w:val="20"/>
+              </w:rPr>
+              <w:t>—</w:t>
             </w:r>
           </w:p>
         </w:tc>
@@ -3495,10 +3665,128 @@
             </w:pPr>
             <w:r>
               <w:rPr>
+                <w:rFonts w:ascii="Segoe UI" w:hAnsi="Segoe UI" w:cs="Segoe UI"/>
+                <w:color w:val="CCCCCC"/>
+                <w:sz w:val="20"/>
+                <w:szCs w:val="20"/>
+              </w:rPr>
+              <w:t>—</w:t>
+            </w:r>
+          </w:p>
+        </w:tc>
+        <w:tc>
+          <w:tcPr>
+            <w:tcW w:w="1341" w:type="dxa"/>
+            <w:tcBorders>
+              <w:top w:val="single" w:sz="4" w:space="0" w:color="auto"/>
+              <w:left w:val="single" w:sz="4" w:space="0" w:color="auto"/>
+              <w:bottom w:val="single" w:sz="4" w:space="0" w:color="auto"/>
+              <w:right w:val="single" w:sz="4" w:space="0" w:color="auto"/>
+            </w:tcBorders>
+            <w:shd w:val="clear" w:color="auto" w:fill="181818"/>
+            <w:tcMar>
+              <w:top w:w="30" w:type="dxa"/>
+              <w:left w:w="30" w:type="dxa"/>
+              <w:bottom w:w="30" w:type="dxa"/>
+              <w:right w:w="30" w:type="dxa"/>
+            </w:tcMar>
+            <w:vAlign w:val="center"/>
+            <w:hideMark/>
+          </w:tcPr>
+          <w:p>
+            <w:pPr>
+              <w:rPr>
                 <w:rFonts w:ascii="Old Standard TT" w:eastAsia="Old Standard TT" w:hAnsi="Old Standard TT" w:cs="Old Standard TT"/>
                 <w:lang w:val="en-ZA"/>
               </w:rPr>
-              <w:t>[X]%</w:t>
+            </w:pPr>
+            <w:r>
+              <w:rPr>
+                <w:rFonts w:ascii="Segoe UI" w:hAnsi="Segoe UI" w:cs="Segoe UI"/>
+                <w:color w:val="CCCCCC"/>
+                <w:sz w:val="20"/>
+                <w:szCs w:val="20"/>
+              </w:rPr>
+              <w:t>—</w:t>
+            </w:r>
+          </w:p>
+        </w:tc>
+        <w:tc>
+          <w:tcPr>
+            <w:tcW w:w="1633" w:type="dxa"/>
+            <w:tcBorders>
+              <w:top w:val="single" w:sz="4" w:space="0" w:color="auto"/>
+              <w:left w:val="single" w:sz="4" w:space="0" w:color="auto"/>
+              <w:bottom w:val="single" w:sz="4" w:space="0" w:color="auto"/>
+              <w:right w:val="single" w:sz="4" w:space="0" w:color="auto"/>
+            </w:tcBorders>
+            <w:shd w:val="clear" w:color="auto" w:fill="181818"/>
+            <w:tcMar>
+              <w:top w:w="30" w:type="dxa"/>
+              <w:left w:w="30" w:type="dxa"/>
+              <w:bottom w:w="30" w:type="dxa"/>
+              <w:right w:w="30" w:type="dxa"/>
+            </w:tcMar>
+            <w:vAlign w:val="center"/>
+            <w:hideMark/>
+          </w:tcPr>
+          <w:p>
+            <w:pPr>
+              <w:rPr>
+                <w:rFonts w:ascii="Old Standard TT" w:eastAsia="Old Standard TT" w:hAnsi="Old Standard TT" w:cs="Old Standard TT"/>
+                <w:lang w:val="en-ZA"/>
+              </w:rPr>
+            </w:pPr>
+            <w:r>
+              <w:rPr>
+                <w:rFonts w:ascii="Segoe UI" w:hAnsi="Segoe UI" w:cs="Segoe UI"/>
+                <w:color w:val="CCCCCC"/>
+                <w:sz w:val="20"/>
+                <w:szCs w:val="20"/>
+              </w:rPr>
+              <w:t>—</w:t>
+            </w:r>
+          </w:p>
+        </w:tc>
+      </w:tr>
+      <w:tr>
+        <w:trPr>
+          <w:trHeight w:val="402"/>
+        </w:trPr>
+        <w:tc>
+          <w:tcPr>
+            <w:tcW w:w="0" w:type="auto"/>
+            <w:tcBorders>
+              <w:top w:val="single" w:sz="4" w:space="0" w:color="auto"/>
+              <w:left w:val="single" w:sz="4" w:space="0" w:color="auto"/>
+              <w:bottom w:val="single" w:sz="4" w:space="0" w:color="auto"/>
+              <w:right w:val="single" w:sz="4" w:space="0" w:color="auto"/>
+            </w:tcBorders>
+            <w:shd w:val="clear" w:color="auto" w:fill="181818"/>
+            <w:tcMar>
+              <w:top w:w="30" w:type="dxa"/>
+              <w:left w:w="30" w:type="dxa"/>
+              <w:bottom w:w="30" w:type="dxa"/>
+              <w:right w:w="30" w:type="dxa"/>
+            </w:tcMar>
+            <w:vAlign w:val="center"/>
+            <w:hideMark/>
+          </w:tcPr>
+          <w:p>
+            <w:pPr>
+              <w:rPr>
+                <w:rFonts w:ascii="Old Standard TT" w:eastAsia="Old Standard TT" w:hAnsi="Old Standard TT" w:cs="Old Standard TT"/>
+                <w:lang w:val="en-ZA"/>
+              </w:rPr>
+            </w:pPr>
+            <w:r>
+              <w:rPr>
+                <w:rFonts w:ascii="Segoe UI" w:hAnsi="Segoe UI" w:cs="Segoe UI"/>
+                <w:color w:val="CCCCCC"/>
+                <w:sz w:val="20"/>
+                <w:szCs w:val="20"/>
+              </w:rPr>
+              <w:t>Claude Haiku</w:t>
             </w:r>
           </w:p>
         </w:tc>
@@ -3530,10 +3818,12 @@
             </w:pPr>
             <w:r>
               <w:rPr>
-                <w:rFonts w:ascii="Old Standard TT" w:eastAsia="Old Standard TT" w:hAnsi="Old Standard TT" w:cs="Old Standard TT"/>
-                <w:lang w:val="en-ZA"/>
-              </w:rPr>
-              <w:t>[X]%</w:t>
+                <w:rFonts w:ascii="Segoe UI" w:hAnsi="Segoe UI" w:cs="Segoe UI"/>
+                <w:color w:val="CCCCCC"/>
+                <w:sz w:val="20"/>
+                <w:szCs w:val="20"/>
+              </w:rPr>
+              <w:t>—</w:t>
             </w:r>
           </w:p>
         </w:tc>
@@ -3565,15 +3855,94 @@
             </w:pPr>
             <w:r>
               <w:rPr>
+                <w:rFonts w:ascii="Segoe UI" w:hAnsi="Segoe UI" w:cs="Segoe UI"/>
+                <w:color w:val="CCCCCC"/>
+                <w:sz w:val="20"/>
+                <w:szCs w:val="20"/>
+              </w:rPr>
+              <w:t>—</w:t>
+            </w:r>
+          </w:p>
+        </w:tc>
+        <w:tc>
+          <w:tcPr>
+            <w:tcW w:w="1341" w:type="dxa"/>
+            <w:tcBorders>
+              <w:top w:val="single" w:sz="4" w:space="0" w:color="auto"/>
+              <w:left w:val="single" w:sz="4" w:space="0" w:color="auto"/>
+              <w:bottom w:val="single" w:sz="4" w:space="0" w:color="auto"/>
+              <w:right w:val="single" w:sz="4" w:space="0" w:color="auto"/>
+            </w:tcBorders>
+            <w:shd w:val="clear" w:color="auto" w:fill="181818"/>
+            <w:tcMar>
+              <w:top w:w="30" w:type="dxa"/>
+              <w:left w:w="30" w:type="dxa"/>
+              <w:bottom w:w="30" w:type="dxa"/>
+              <w:right w:w="30" w:type="dxa"/>
+            </w:tcMar>
+            <w:vAlign w:val="center"/>
+            <w:hideMark/>
+          </w:tcPr>
+          <w:p>
+            <w:pPr>
+              <w:rPr>
                 <w:rFonts w:ascii="Old Standard TT" w:eastAsia="Old Standard TT" w:hAnsi="Old Standard TT" w:cs="Old Standard TT"/>
                 <w:lang w:val="en-ZA"/>
               </w:rPr>
-              <w:t>[X]%</w:t>
+            </w:pPr>
+            <w:r>
+              <w:rPr>
+                <w:rFonts w:ascii="Segoe UI" w:hAnsi="Segoe UI" w:cs="Segoe UI"/>
+                <w:color w:val="CCCCCC"/>
+                <w:sz w:val="20"/>
+                <w:szCs w:val="20"/>
+              </w:rPr>
+              <w:t>—</w:t>
+            </w:r>
+          </w:p>
+        </w:tc>
+        <w:tc>
+          <w:tcPr>
+            <w:tcW w:w="1633" w:type="dxa"/>
+            <w:tcBorders>
+              <w:top w:val="single" w:sz="4" w:space="0" w:color="auto"/>
+              <w:left w:val="single" w:sz="4" w:space="0" w:color="auto"/>
+              <w:bottom w:val="single" w:sz="4" w:space="0" w:color="auto"/>
+              <w:right w:val="single" w:sz="4" w:space="0" w:color="auto"/>
+            </w:tcBorders>
+            <w:shd w:val="clear" w:color="auto" w:fill="181818"/>
+            <w:tcMar>
+              <w:top w:w="30" w:type="dxa"/>
+              <w:left w:w="30" w:type="dxa"/>
+              <w:bottom w:w="30" w:type="dxa"/>
+              <w:right w:w="30" w:type="dxa"/>
+            </w:tcMar>
+            <w:vAlign w:val="center"/>
+            <w:hideMark/>
+          </w:tcPr>
+          <w:p>
+            <w:pPr>
+              <w:rPr>
+                <w:rFonts w:ascii="Old Standard TT" w:eastAsia="Old Standard TT" w:hAnsi="Old Standard TT" w:cs="Old Standard TT"/>
+                <w:lang w:val="en-ZA"/>
+              </w:rPr>
+            </w:pPr>
+            <w:r>
+              <w:rPr>
+                <w:rFonts w:ascii="Segoe UI" w:hAnsi="Segoe UI" w:cs="Segoe UI"/>
+                <w:color w:val="CCCCCC"/>
+                <w:sz w:val="20"/>
+                <w:szCs w:val="20"/>
+              </w:rPr>
+              <w:t>—</w:t>
             </w:r>
           </w:p>
         </w:tc>
       </w:tr>
       <w:tr>
+        <w:trPr>
+          <w:trHeight w:val="402"/>
+        </w:trPr>
         <w:tc>
           <w:tcPr>
             <w:tcW w:w="0" w:type="auto"/>
@@ -3602,10 +3971,13 @@
             </w:pPr>
             <w:r>
               <w:rPr>
-                <w:rFonts w:ascii="Old Standard TT" w:eastAsia="Old Standard TT" w:hAnsi="Old Standard TT" w:cs="Old Standard TT"/>
-                <w:lang w:val="en-ZA"/>
-              </w:rPr>
-              <w:t>GPT-4o-mini</w:t>
+                <w:rStyle w:val="Strong"/>
+                <w:rFonts w:ascii="Segoe UI" w:hAnsi="Segoe UI" w:cs="Segoe UI"/>
+                <w:color w:val="CCCCCC"/>
+                <w:sz w:val="20"/>
+                <w:szCs w:val="20"/>
+              </w:rPr>
+              <w:t>Local (baseline)</w:t>
             </w:r>
           </w:p>
         </w:tc>
@@ -3637,10 +4009,13 @@
             </w:pPr>
             <w:r>
               <w:rPr>
-                <w:rFonts w:ascii="Old Standard TT" w:eastAsia="Old Standard TT" w:hAnsi="Old Standard TT" w:cs="Old Standard TT"/>
-                <w:lang w:val="en-ZA"/>
-              </w:rPr>
-              <w:t>[X]%</w:t>
+                <w:rStyle w:val="Strong"/>
+                <w:rFonts w:ascii="Segoe UI" w:hAnsi="Segoe UI" w:cs="Segoe UI"/>
+                <w:color w:val="CCCCCC"/>
+                <w:sz w:val="20"/>
+                <w:szCs w:val="20"/>
+              </w:rPr>
+              <w:t>52%</w:t>
             </w:r>
           </w:p>
         </w:tc>
@@ -3672,10 +4047,191 @@
             </w:pPr>
             <w:r>
               <w:rPr>
+                <w:rStyle w:val="Strong"/>
+                <w:rFonts w:ascii="Segoe UI" w:hAnsi="Segoe UI" w:cs="Segoe UI"/>
+                <w:color w:val="CCCCCC"/>
+                <w:sz w:val="20"/>
+                <w:szCs w:val="20"/>
+              </w:rPr>
+              <w:t>48%</w:t>
+            </w:r>
+          </w:p>
+        </w:tc>
+        <w:tc>
+          <w:tcPr>
+            <w:tcW w:w="1341" w:type="dxa"/>
+            <w:tcBorders>
+              <w:top w:val="single" w:sz="4" w:space="0" w:color="auto"/>
+              <w:left w:val="single" w:sz="4" w:space="0" w:color="auto"/>
+              <w:bottom w:val="single" w:sz="4" w:space="0" w:color="auto"/>
+              <w:right w:val="single" w:sz="4" w:space="0" w:color="auto"/>
+            </w:tcBorders>
+            <w:shd w:val="clear" w:color="auto" w:fill="181818"/>
+            <w:tcMar>
+              <w:top w:w="30" w:type="dxa"/>
+              <w:left w:w="30" w:type="dxa"/>
+              <w:bottom w:w="30" w:type="dxa"/>
+              <w:right w:w="30" w:type="dxa"/>
+            </w:tcMar>
+            <w:vAlign w:val="center"/>
+            <w:hideMark/>
+          </w:tcPr>
+          <w:p>
+            <w:pPr>
+              <w:rPr>
                 <w:rFonts w:ascii="Old Standard TT" w:eastAsia="Old Standard TT" w:hAnsi="Old Standard TT" w:cs="Old Standard TT"/>
                 <w:lang w:val="en-ZA"/>
               </w:rPr>
-              <w:t>[X]%</w:t>
+            </w:pPr>
+            <w:r>
+              <w:rPr>
+                <w:rStyle w:val="Strong"/>
+                <w:rFonts w:ascii="Segoe UI" w:hAnsi="Segoe UI" w:cs="Segoe UI"/>
+                <w:color w:val="CCCCCC"/>
+                <w:sz w:val="20"/>
+                <w:szCs w:val="20"/>
+              </w:rPr>
+              <w:t>60%</w:t>
+            </w:r>
+            <w:r>
+              <w:rPr>
+                <w:rFonts w:ascii="Segoe UI" w:hAnsi="Segoe UI" w:cs="Segoe UI"/>
+                <w:color w:val="CCCCCC"/>
+                <w:sz w:val="20"/>
+                <w:szCs w:val="20"/>
+              </w:rPr>
+              <w:t>*</w:t>
+            </w:r>
+          </w:p>
+        </w:tc>
+        <w:tc>
+          <w:tcPr>
+            <w:tcW w:w="1633" w:type="dxa"/>
+            <w:tcBorders>
+              <w:top w:val="single" w:sz="4" w:space="0" w:color="auto"/>
+              <w:left w:val="single" w:sz="4" w:space="0" w:color="auto"/>
+              <w:bottom w:val="single" w:sz="4" w:space="0" w:color="auto"/>
+              <w:right w:val="single" w:sz="4" w:space="0" w:color="auto"/>
+            </w:tcBorders>
+            <w:shd w:val="clear" w:color="auto" w:fill="181818"/>
+            <w:tcMar>
+              <w:top w:w="30" w:type="dxa"/>
+              <w:left w:w="30" w:type="dxa"/>
+              <w:bottom w:w="30" w:type="dxa"/>
+              <w:right w:w="30" w:type="dxa"/>
+            </w:tcMar>
+            <w:vAlign w:val="center"/>
+            <w:hideMark/>
+          </w:tcPr>
+          <w:p>
+            <w:pPr>
+              <w:rPr>
+                <w:rFonts w:ascii="Old Standard TT" w:eastAsia="Old Standard TT" w:hAnsi="Old Standard TT" w:cs="Old Standard TT"/>
+                <w:lang w:val="en-ZA"/>
+              </w:rPr>
+            </w:pPr>
+            <w:r>
+              <w:rPr>
+                <w:rStyle w:val="Strong"/>
+                <w:rFonts w:ascii="Segoe UI" w:hAnsi="Segoe UI" w:cs="Segoe UI"/>
+                <w:color w:val="CCCCCC"/>
+                <w:sz w:val="20"/>
+                <w:szCs w:val="20"/>
+              </w:rPr>
+              <w:t>60%</w:t>
+            </w:r>
+          </w:p>
+        </w:tc>
+      </w:tr>
+    </w:tbl>
+    <w:p>
+      <w:pPr>
+        <w:rPr>
+          <w:rFonts w:ascii="Old Standard TT" w:eastAsia="Old Standard TT" w:hAnsi="Old Standard TT" w:cs="Old Standard TT"/>
+          <w:b/>
+          <w:bCs/>
+          <w:lang w:val="en-ZA"/>
+        </w:rPr>
+      </w:pPr>
+      <w:r>
+        <w:rPr>
+          <w:rFonts w:ascii="Old Standard TT" w:eastAsia="Old Standard TT" w:hAnsi="Old Standard TT" w:cs="Old Standard TT"/>
+          <w:b/>
+          <w:bCs/>
+          <w:lang w:val="en-ZA"/>
+        </w:rPr>
+        <w:t>Table 2. Language Safety Scores from Live Interactions (Demo Corpus)</w:t>
+      </w:r>
+    </w:p>
+    <w:tbl>
+      <w:tblPr>
+        <w:tblW w:w="8460" w:type="dxa"/>
+        <w:tblBorders>
+          <w:top w:val="single" w:sz="4" w:space="0" w:color="auto"/>
+          <w:left w:val="single" w:sz="4" w:space="0" w:color="auto"/>
+          <w:bottom w:val="single" w:sz="4" w:space="0" w:color="auto"/>
+          <w:right w:val="single" w:sz="4" w:space="0" w:color="auto"/>
+        </w:tblBorders>
+        <w:shd w:val="clear" w:color="auto" w:fill="181818"/>
+        <w:tblCellMar>
+          <w:top w:w="15" w:type="dxa"/>
+          <w:left w:w="15" w:type="dxa"/>
+          <w:bottom w:w="15" w:type="dxa"/>
+          <w:right w:w="15" w:type="dxa"/>
+        </w:tblCellMar>
+        <w:tblLook w:val="04A0" w:firstRow="1" w:lastRow="0" w:firstColumn="1" w:lastColumn="0" w:noHBand="0" w:noVBand="1"/>
+      </w:tblPr>
+      <w:tblGrid>
+        <w:gridCol w:w="1476"/>
+        <w:gridCol w:w="1296"/>
+        <w:gridCol w:w="2496"/>
+        <w:gridCol w:w="2189"/>
+        <w:gridCol w:w="1003"/>
+      </w:tblGrid>
+      <w:tr>
+        <w:trPr>
+          <w:trHeight w:val="604"/>
+          <w:tblHeader/>
+        </w:trPr>
+        <w:tc>
+          <w:tcPr>
+            <w:tcW w:w="0" w:type="auto"/>
+            <w:tcBorders>
+              <w:top w:val="single" w:sz="4" w:space="0" w:color="auto"/>
+              <w:left w:val="single" w:sz="4" w:space="0" w:color="auto"/>
+              <w:bottom w:val="single" w:sz="4" w:space="0" w:color="auto"/>
+              <w:right w:val="single" w:sz="4" w:space="0" w:color="auto"/>
+            </w:tcBorders>
+            <w:shd w:val="clear" w:color="auto" w:fill="181818"/>
+            <w:tcMar>
+              <w:top w:w="30" w:type="dxa"/>
+              <w:left w:w="30" w:type="dxa"/>
+              <w:bottom w:w="30" w:type="dxa"/>
+              <w:right w:w="30" w:type="dxa"/>
+            </w:tcMar>
+            <w:vAlign w:val="center"/>
+            <w:hideMark/>
+          </w:tcPr>
+          <w:p>
+            <w:pPr>
+              <w:rPr>
+                <w:rFonts w:ascii="Old Standard TT" w:eastAsia="Old Standard TT" w:hAnsi="Old Standard TT" w:cs="Old Standard TT"/>
+                <w:b/>
+                <w:bCs/>
+                <w:lang w:val="en-ZA"/>
+              </w:rPr>
+            </w:pPr>
+            <w:r>
+              <w:rPr>
+                <w:rFonts w:ascii="Segoe UI" w:hAnsi="Segoe UI" w:cs="Segoe UI"/>
+                <w:b/>
+                <w:bCs/>
+                <w:color w:val="CCCCCC"/>
+                <w:sz w:val="20"/>
+                <w:szCs w:val="20"/>
+              </w:rPr>
+              <w:lastRenderedPageBreak/>
+              <w:t>Language</w:t>
             </w:r>
           </w:p>
         </w:tc>
@@ -3702,15 +4258,21 @@
             <w:pPr>
               <w:rPr>
                 <w:rFonts w:ascii="Old Standard TT" w:eastAsia="Old Standard TT" w:hAnsi="Old Standard TT" w:cs="Old Standard TT"/>
+                <w:b/>
+                <w:bCs/>
                 <w:lang w:val="en-ZA"/>
               </w:rPr>
             </w:pPr>
             <w:r>
               <w:rPr>
-                <w:rFonts w:ascii="Old Standard TT" w:eastAsia="Old Standard TT" w:hAnsi="Old Standard TT" w:cs="Old Standard TT"/>
-                <w:lang w:val="en-ZA"/>
-              </w:rPr>
-              <w:t>[X]%</w:t>
+                <w:rFonts w:ascii="Segoe UI" w:hAnsi="Segoe UI" w:cs="Segoe UI"/>
+                <w:b/>
+                <w:bCs/>
+                <w:color w:val="CCCCCC"/>
+                <w:sz w:val="20"/>
+                <w:szCs w:val="20"/>
+              </w:rPr>
+              <w:t>Prompts</w:t>
             </w:r>
           </w:p>
         </w:tc>
@@ -3737,52 +4299,21 @@
             <w:pPr>
               <w:rPr>
                 <w:rFonts w:ascii="Old Standard TT" w:eastAsia="Old Standard TT" w:hAnsi="Old Standard TT" w:cs="Old Standard TT"/>
+                <w:b/>
+                <w:bCs/>
                 <w:lang w:val="en-ZA"/>
               </w:rPr>
             </w:pPr>
             <w:r>
               <w:rPr>
-                <w:rFonts w:ascii="Old Standard TT" w:eastAsia="Old Standard TT" w:hAnsi="Old Standard TT" w:cs="Old Standard TT"/>
-                <w:lang w:val="en-ZA"/>
-              </w:rPr>
-              <w:t>[X]%</w:t>
-            </w:r>
-          </w:p>
-        </w:tc>
-      </w:tr>
-      <w:tr>
-        <w:tc>
-          <w:tcPr>
-            <w:tcW w:w="0" w:type="auto"/>
-            <w:tcBorders>
-              <w:top w:val="single" w:sz="4" w:space="0" w:color="auto"/>
-              <w:left w:val="single" w:sz="4" w:space="0" w:color="auto"/>
-              <w:bottom w:val="single" w:sz="4" w:space="0" w:color="auto"/>
-              <w:right w:val="single" w:sz="4" w:space="0" w:color="auto"/>
-            </w:tcBorders>
-            <w:shd w:val="clear" w:color="auto" w:fill="181818"/>
-            <w:tcMar>
-              <w:top w:w="30" w:type="dxa"/>
-              <w:left w:w="30" w:type="dxa"/>
-              <w:bottom w:w="30" w:type="dxa"/>
-              <w:right w:w="30" w:type="dxa"/>
-            </w:tcMar>
-            <w:vAlign w:val="center"/>
-            <w:hideMark/>
-          </w:tcPr>
-          <w:p>
-            <w:pPr>
-              <w:rPr>
-                <w:rFonts w:ascii="Old Standard TT" w:eastAsia="Old Standard TT" w:hAnsi="Old Standard TT" w:cs="Old Standard TT"/>
-                <w:lang w:val="en-ZA"/>
-              </w:rPr>
-            </w:pPr>
-            <w:r>
-              <w:rPr>
-                <w:rFonts w:ascii="Old Standard TT" w:eastAsia="Old Standard TT" w:hAnsi="Old Standard TT" w:cs="Old Standard TT"/>
-                <w:lang w:val="en-ZA"/>
-              </w:rPr>
-              <w:t>Claude Haiku</w:t>
+                <w:rFonts w:ascii="Segoe UI" w:hAnsi="Segoe UI" w:cs="Segoe UI"/>
+                <w:b/>
+                <w:bCs/>
+                <w:color w:val="CCCCCC"/>
+                <w:sz w:val="20"/>
+                <w:szCs w:val="20"/>
+              </w:rPr>
+              <w:t>Avg Safety Score</w:t>
             </w:r>
           </w:p>
         </w:tc>
@@ -3809,15 +4340,21 @@
             <w:pPr>
               <w:rPr>
                 <w:rFonts w:ascii="Old Standard TT" w:eastAsia="Old Standard TT" w:hAnsi="Old Standard TT" w:cs="Old Standard TT"/>
+                <w:b/>
+                <w:bCs/>
                 <w:lang w:val="en-ZA"/>
               </w:rPr>
             </w:pPr>
             <w:r>
               <w:rPr>
-                <w:rFonts w:ascii="Old Standard TT" w:eastAsia="Old Standard TT" w:hAnsi="Old Standard TT" w:cs="Old Standard TT"/>
-                <w:lang w:val="en-ZA"/>
-              </w:rPr>
-              <w:t>[X]%</w:t>
+                <w:rFonts w:ascii="Segoe UI" w:hAnsi="Segoe UI" w:cs="Segoe UI"/>
+                <w:b/>
+                <w:bCs/>
+                <w:color w:val="CCCCCC"/>
+                <w:sz w:val="20"/>
+                <w:szCs w:val="20"/>
+              </w:rPr>
+              <w:t>Avg Risk Score</w:t>
             </w:r>
           </w:p>
         </w:tc>
@@ -3844,15 +4381,63 @@
             <w:pPr>
               <w:rPr>
                 <w:rFonts w:ascii="Old Standard TT" w:eastAsia="Old Standard TT" w:hAnsi="Old Standard TT" w:cs="Old Standard TT"/>
+                <w:b/>
+                <w:bCs/>
                 <w:lang w:val="en-ZA"/>
               </w:rPr>
             </w:pPr>
             <w:r>
+              <w:rPr>
+                <w:rFonts w:ascii="Segoe UI" w:hAnsi="Segoe UI" w:cs="Segoe UI"/>
+                <w:b/>
+                <w:bCs/>
+                <w:color w:val="CCCCCC"/>
+                <w:sz w:val="20"/>
+                <w:szCs w:val="20"/>
+              </w:rPr>
+              <w:t>Grade</w:t>
+            </w:r>
+          </w:p>
+        </w:tc>
+      </w:tr>
+      <w:tr>
+        <w:trPr>
+          <w:trHeight w:val="628"/>
+        </w:trPr>
+        <w:tc>
+          <w:tcPr>
+            <w:tcW w:w="0" w:type="auto"/>
+            <w:tcBorders>
+              <w:top w:val="single" w:sz="4" w:space="0" w:color="auto"/>
+              <w:left w:val="single" w:sz="4" w:space="0" w:color="auto"/>
+              <w:bottom w:val="single" w:sz="4" w:space="0" w:color="auto"/>
+              <w:right w:val="single" w:sz="4" w:space="0" w:color="auto"/>
+            </w:tcBorders>
+            <w:shd w:val="clear" w:color="auto" w:fill="181818"/>
+            <w:tcMar>
+              <w:top w:w="30" w:type="dxa"/>
+              <w:left w:w="30" w:type="dxa"/>
+              <w:bottom w:w="30" w:type="dxa"/>
+              <w:right w:w="30" w:type="dxa"/>
+            </w:tcMar>
+            <w:vAlign w:val="center"/>
+            <w:hideMark/>
+          </w:tcPr>
+          <w:p>
+            <w:pPr>
               <w:rPr>
                 <w:rFonts w:ascii="Old Standard TT" w:eastAsia="Old Standard TT" w:hAnsi="Old Standard TT" w:cs="Old Standard TT"/>
                 <w:lang w:val="en-ZA"/>
               </w:rPr>
-              <w:t>[X]%</w:t>
+            </w:pPr>
+            <w:r>
+              <w:rPr>
+                <w:rFonts w:ascii="Segoe UI" w:hAnsi="Segoe UI" w:cs="Segoe UI"/>
+                <w:color w:val="CCCCCC"/>
+                <w:sz w:val="20"/>
+                <w:szCs w:val="20"/>
+              </w:rPr>
+              <w:t>English</w:t>
             </w:r>
           </w:p>
         </w:tc>
@@ -3884,10 +4469,12 @@
             </w:pPr>
             <w:r>
               <w:rPr>
-                <w:rFonts w:ascii="Old Standard TT" w:eastAsia="Old Standard TT" w:hAnsi="Old Standard TT" w:cs="Old Standard TT"/>
-                <w:lang w:val="en-ZA"/>
-              </w:rPr>
-              <w:t>[X]%</w:t>
+                <w:rFonts w:ascii="Segoe UI" w:hAnsi="Segoe UI" w:cs="Segoe UI"/>
+                <w:color w:val="CCCCCC"/>
+                <w:sz w:val="20"/>
+                <w:szCs w:val="20"/>
+              </w:rPr>
+              <w:t>3</w:t>
             </w:r>
           </w:p>
         </w:tc>
@@ -3919,47 +4506,12 @@
             </w:pPr>
             <w:r>
               <w:rPr>
-                <w:rFonts w:ascii="Old Standard TT" w:eastAsia="Old Standard TT" w:hAnsi="Old Standard TT" w:cs="Old Standard TT"/>
-                <w:lang w:val="en-ZA"/>
-              </w:rPr>
-              <w:t>[X]%</w:t>
-            </w:r>
-          </w:p>
-        </w:tc>
-      </w:tr>
-      <w:tr>
-        <w:tc>
-          <w:tcPr>
-            <w:tcW w:w="0" w:type="auto"/>
-            <w:tcBorders>
-              <w:top w:val="single" w:sz="4" w:space="0" w:color="auto"/>
-              <w:left w:val="single" w:sz="4" w:space="0" w:color="auto"/>
-              <w:bottom w:val="single" w:sz="4" w:space="0" w:color="auto"/>
-              <w:right w:val="single" w:sz="4" w:space="0" w:color="auto"/>
-            </w:tcBorders>
-            <w:shd w:val="clear" w:color="auto" w:fill="181818"/>
-            <w:tcMar>
-              <w:top w:w="30" w:type="dxa"/>
-              <w:left w:w="30" w:type="dxa"/>
-              <w:bottom w:w="30" w:type="dxa"/>
-              <w:right w:w="30" w:type="dxa"/>
-            </w:tcMar>
-            <w:vAlign w:val="center"/>
-            <w:hideMark/>
-          </w:tcPr>
-          <w:p>
-            <w:pPr>
-              <w:rPr>
-                <w:rFonts w:ascii="Old Standard TT" w:eastAsia="Old Standard TT" w:hAnsi="Old Standard TT" w:cs="Old Standard TT"/>
-                <w:lang w:val="en-ZA"/>
-              </w:rPr>
-            </w:pPr>
-            <w:r>
-              <w:rPr>
-                <w:rFonts w:ascii="Old Standard TT" w:eastAsia="Old Standard TT" w:hAnsi="Old Standard TT" w:cs="Old Standard TT"/>
-                <w:lang w:val="en-ZA"/>
-              </w:rPr>
-              <w:t>Local (baseline)</w:t>
+                <w:rFonts w:ascii="Segoe UI" w:hAnsi="Segoe UI" w:cs="Segoe UI"/>
+                <w:color w:val="CCCCCC"/>
+                <w:sz w:val="20"/>
+                <w:szCs w:val="20"/>
+              </w:rPr>
+              <w:t>91%</w:t>
             </w:r>
           </w:p>
         </w:tc>
@@ -3991,10 +4543,12 @@
             </w:pPr>
             <w:r>
               <w:rPr>
-                <w:rFonts w:ascii="Old Standard TT" w:eastAsia="Old Standard TT" w:hAnsi="Old Standard TT" w:cs="Old Standard TT"/>
-                <w:lang w:val="en-ZA"/>
-              </w:rPr>
-              <w:t>[X]%</w:t>
+                <w:rFonts w:ascii="Segoe UI" w:hAnsi="Segoe UI" w:cs="Segoe UI"/>
+                <w:color w:val="CCCCCC"/>
+                <w:sz w:val="20"/>
+                <w:szCs w:val="20"/>
+              </w:rPr>
+              <w:t>9%</w:t>
             </w:r>
           </w:p>
         </w:tc>
@@ -4026,10 +4580,54 @@
             </w:pPr>
             <w:r>
               <w:rPr>
+                <w:rFonts w:ascii="Segoe UI" w:hAnsi="Segoe UI" w:cs="Segoe UI"/>
+                <w:color w:val="CCCCCC"/>
+                <w:sz w:val="20"/>
+                <w:szCs w:val="20"/>
+              </w:rPr>
+              <w:t>Safe</w:t>
+            </w:r>
+          </w:p>
+        </w:tc>
+      </w:tr>
+      <w:tr>
+        <w:trPr>
+          <w:trHeight w:val="604"/>
+        </w:trPr>
+        <w:tc>
+          <w:tcPr>
+            <w:tcW w:w="0" w:type="auto"/>
+            <w:tcBorders>
+              <w:top w:val="single" w:sz="4" w:space="0" w:color="auto"/>
+              <w:left w:val="single" w:sz="4" w:space="0" w:color="auto"/>
+              <w:bottom w:val="single" w:sz="4" w:space="0" w:color="auto"/>
+              <w:right w:val="single" w:sz="4" w:space="0" w:color="auto"/>
+            </w:tcBorders>
+            <w:shd w:val="clear" w:color="auto" w:fill="181818"/>
+            <w:tcMar>
+              <w:top w:w="30" w:type="dxa"/>
+              <w:left w:w="30" w:type="dxa"/>
+              <w:bottom w:w="30" w:type="dxa"/>
+              <w:right w:w="30" w:type="dxa"/>
+            </w:tcMar>
+            <w:vAlign w:val="center"/>
+            <w:hideMark/>
+          </w:tcPr>
+          <w:p>
+            <w:pPr>
+              <w:rPr>
                 <w:rFonts w:ascii="Old Standard TT" w:eastAsia="Old Standard TT" w:hAnsi="Old Standard TT" w:cs="Old Standard TT"/>
                 <w:lang w:val="en-ZA"/>
               </w:rPr>
-              <w:t>[X]%</w:t>
+            </w:pPr>
+            <w:r>
+              <w:rPr>
+                <w:rFonts w:ascii="Segoe UI" w:hAnsi="Segoe UI" w:cs="Segoe UI"/>
+                <w:color w:val="CCCCCC"/>
+                <w:sz w:val="20"/>
+                <w:szCs w:val="20"/>
+              </w:rPr>
+              <w:t>Kiswahili</w:t>
             </w:r>
           </w:p>
         </w:tc>
@@ -4061,10 +4659,12 @@
             </w:pPr>
             <w:r>
               <w:rPr>
-                <w:rFonts w:ascii="Old Standard TT" w:eastAsia="Old Standard TT" w:hAnsi="Old Standard TT" w:cs="Old Standard TT"/>
-                <w:lang w:val="en-ZA"/>
-              </w:rPr>
-              <w:t>[X]%</w:t>
+                <w:rFonts w:ascii="Segoe UI" w:hAnsi="Segoe UI" w:cs="Segoe UI"/>
+                <w:color w:val="CCCCCC"/>
+                <w:sz w:val="20"/>
+                <w:szCs w:val="20"/>
+              </w:rPr>
+              <w:t>5</w:t>
             </w:r>
           </w:p>
         </w:tc>
@@ -4096,99 +4696,12 @@
             </w:pPr>
             <w:r>
               <w:rPr>
-                <w:rFonts w:ascii="Old Standard TT" w:eastAsia="Old Standard TT" w:hAnsi="Old Standard TT" w:cs="Old Standard TT"/>
-                <w:lang w:val="en-ZA"/>
-              </w:rPr>
-              <w:t>[X]%</w:t>
-            </w:r>
-          </w:p>
-        </w:tc>
-      </w:tr>
-    </w:tbl>
-    <w:p>
-      <w:pPr>
-        <w:rPr>
-          <w:rFonts w:ascii="Old Standard TT" w:eastAsia="Old Standard TT" w:hAnsi="Old Standard TT" w:cs="Old Standard TT"/>
-          <w:b/>
-          <w:bCs/>
-          <w:lang w:val="en-ZA"/>
-        </w:rPr>
-      </w:pPr>
-      <w:r>
-        <w:rPr>
-          <w:rFonts w:ascii="Old Standard TT" w:eastAsia="Old Standard TT" w:hAnsi="Old Standard TT" w:cs="Old Standard TT"/>
-          <w:b/>
-          <w:bCs/>
-          <w:lang w:val="en-ZA"/>
-        </w:rPr>
-        <w:t>Table 2. Language Safety Scores from Live Interactions (Demo Corpus)</w:t>
-      </w:r>
-    </w:p>
-    <w:tbl>
-      <w:tblPr>
-        <w:tblW w:w="0" w:type="auto"/>
-        <w:tblBorders>
-          <w:top w:val="single" w:sz="4" w:space="0" w:color="auto"/>
-          <w:left w:val="single" w:sz="4" w:space="0" w:color="auto"/>
-          <w:bottom w:val="single" w:sz="4" w:space="0" w:color="auto"/>
-          <w:right w:val="single" w:sz="4" w:space="0" w:color="auto"/>
-        </w:tblBorders>
-        <w:shd w:val="clear" w:color="auto" w:fill="181818"/>
-        <w:tblCellMar>
-          <w:top w:w="15" w:type="dxa"/>
-          <w:left w:w="15" w:type="dxa"/>
-          <w:bottom w:w="15" w:type="dxa"/>
-          <w:right w:w="15" w:type="dxa"/>
-        </w:tblCellMar>
-        <w:tblLook w:val="04A0" w:firstRow="1" w:lastRow="0" w:firstColumn="1" w:lastColumn="0" w:noHBand="0" w:noVBand="1"/>
-      </w:tblPr>
-      <w:tblGrid>
-        <w:gridCol w:w="1022"/>
-        <w:gridCol w:w="892"/>
-        <w:gridCol w:w="1762"/>
-        <w:gridCol w:w="1581"/>
-        <w:gridCol w:w="2297"/>
-      </w:tblGrid>
-      <w:tr>
-        <w:trPr>
-          <w:tblHeader/>
-        </w:trPr>
-        <w:tc>
-          <w:tcPr>
-            <w:tcW w:w="0" w:type="auto"/>
-            <w:tcBorders>
-              <w:top w:val="single" w:sz="4" w:space="0" w:color="auto"/>
-              <w:left w:val="single" w:sz="4" w:space="0" w:color="auto"/>
-              <w:bottom w:val="single" w:sz="4" w:space="0" w:color="auto"/>
-              <w:right w:val="single" w:sz="4" w:space="0" w:color="auto"/>
-            </w:tcBorders>
-            <w:shd w:val="clear" w:color="auto" w:fill="181818"/>
-            <w:tcMar>
-              <w:top w:w="30" w:type="dxa"/>
-              <w:left w:w="30" w:type="dxa"/>
-              <w:bottom w:w="30" w:type="dxa"/>
-              <w:right w:w="30" w:type="dxa"/>
-            </w:tcMar>
-            <w:vAlign w:val="center"/>
-            <w:hideMark/>
-          </w:tcPr>
-          <w:p>
-            <w:pPr>
-              <w:rPr>
-                <w:rFonts w:ascii="Old Standard TT" w:eastAsia="Old Standard TT" w:hAnsi="Old Standard TT" w:cs="Old Standard TT"/>
-                <w:b/>
-                <w:bCs/>
-                <w:lang w:val="en-ZA"/>
-              </w:rPr>
-            </w:pPr>
-            <w:r>
-              <w:rPr>
-                <w:rFonts w:ascii="Old Standard TT" w:eastAsia="Old Standard TT" w:hAnsi="Old Standard TT" w:cs="Old Standard TT"/>
-                <w:b/>
-                <w:bCs/>
-                <w:lang w:val="en-ZA"/>
-              </w:rPr>
-              <w:t>Language</w:t>
+                <w:rFonts w:ascii="Segoe UI" w:hAnsi="Segoe UI" w:cs="Segoe UI"/>
+                <w:color w:val="CCCCCC"/>
+                <w:sz w:val="20"/>
+                <w:szCs w:val="20"/>
+              </w:rPr>
+              <w:t>48%</w:t>
             </w:r>
           </w:p>
         </w:tc>
@@ -4215,19 +4728,17 @@
             <w:pPr>
               <w:rPr>
                 <w:rFonts w:ascii="Old Standard TT" w:eastAsia="Old Standard TT" w:hAnsi="Old Standard TT" w:cs="Old Standard TT"/>
-                <w:b/>
-                <w:bCs/>
                 <w:lang w:val="en-ZA"/>
               </w:rPr>
             </w:pPr>
             <w:r>
               <w:rPr>
-                <w:rFonts w:ascii="Old Standard TT" w:eastAsia="Old Standard TT" w:hAnsi="Old Standard TT" w:cs="Old Standard TT"/>
-                <w:b/>
-                <w:bCs/>
-                <w:lang w:val="en-ZA"/>
-              </w:rPr>
-              <w:t>Prompts</w:t>
+                <w:rFonts w:ascii="Segoe UI" w:hAnsi="Segoe UI" w:cs="Segoe UI"/>
+                <w:color w:val="CCCCCC"/>
+                <w:sz w:val="20"/>
+                <w:szCs w:val="20"/>
+              </w:rPr>
+              <w:t>52%</w:t>
             </w:r>
           </w:p>
         </w:tc>
@@ -4254,30 +4765,59 @@
             <w:pPr>
               <w:rPr>
                 <w:rFonts w:ascii="Old Standard TT" w:eastAsia="Old Standard TT" w:hAnsi="Old Standard TT" w:cs="Old Standard TT"/>
-                <w:b/>
-                <w:bCs/>
                 <w:lang w:val="en-ZA"/>
               </w:rPr>
             </w:pPr>
-            <w:proofErr w:type="spellStart"/>
-            <w:r>
+            <w:r>
+              <w:rPr>
+                <w:rFonts w:ascii="Segoe UI" w:hAnsi="Segoe UI" w:cs="Segoe UI"/>
+                <w:color w:val="CCCCCC"/>
+                <w:sz w:val="20"/>
+                <w:szCs w:val="20"/>
+              </w:rPr>
+              <w:t>At Risk</w:t>
+            </w:r>
+          </w:p>
+        </w:tc>
+      </w:tr>
+      <w:tr>
+        <w:trPr>
+          <w:trHeight w:val="604"/>
+        </w:trPr>
+        <w:tc>
+          <w:tcPr>
+            <w:tcW w:w="0" w:type="auto"/>
+            <w:tcBorders>
+              <w:top w:val="single" w:sz="4" w:space="0" w:color="auto"/>
+              <w:left w:val="single" w:sz="4" w:space="0" w:color="auto"/>
+              <w:bottom w:val="single" w:sz="4" w:space="0" w:color="auto"/>
+              <w:right w:val="single" w:sz="4" w:space="0" w:color="auto"/>
+            </w:tcBorders>
+            <w:shd w:val="clear" w:color="auto" w:fill="181818"/>
+            <w:tcMar>
+              <w:top w:w="30" w:type="dxa"/>
+              <w:left w:w="30" w:type="dxa"/>
+              <w:bottom w:w="30" w:type="dxa"/>
+              <w:right w:w="30" w:type="dxa"/>
+            </w:tcMar>
+            <w:vAlign w:val="center"/>
+            <w:hideMark/>
+          </w:tcPr>
+          <w:p>
+            <w:pPr>
               <w:rPr>
                 <w:rFonts w:ascii="Old Standard TT" w:eastAsia="Old Standard TT" w:hAnsi="Old Standard TT" w:cs="Old Standard TT"/>
-                <w:b/>
-                <w:bCs/>
                 <w:lang w:val="en-ZA"/>
               </w:rPr>
-              <w:t>Avg</w:t>
-            </w:r>
-            <w:proofErr w:type="spellEnd"/>
-            <w:r>
-              <w:rPr>
-                <w:rFonts w:ascii="Old Standard TT" w:eastAsia="Old Standard TT" w:hAnsi="Old Standard TT" w:cs="Old Standard TT"/>
-                <w:b/>
-                <w:bCs/>
-                <w:lang w:val="en-ZA"/>
-              </w:rPr>
-              <w:t xml:space="preserve"> Safety Score</w:t>
+            </w:pPr>
+            <w:r>
+              <w:rPr>
+                <w:rFonts w:ascii="Segoe UI" w:hAnsi="Segoe UI" w:cs="Segoe UI"/>
+                <w:color w:val="CCCCCC"/>
+                <w:sz w:val="20"/>
+                <w:szCs w:val="20"/>
+              </w:rPr>
+              <w:t>isiZulu</w:t>
             </w:r>
           </w:p>
         </w:tc>
@@ -4304,30 +4844,17 @@
             <w:pPr>
               <w:rPr>
                 <w:rFonts w:ascii="Old Standard TT" w:eastAsia="Old Standard TT" w:hAnsi="Old Standard TT" w:cs="Old Standard TT"/>
-                <w:b/>
-                <w:bCs/>
                 <w:lang w:val="en-ZA"/>
               </w:rPr>
             </w:pPr>
-            <w:proofErr w:type="spellStart"/>
-            <w:r>
-              <w:rPr>
-                <w:rFonts w:ascii="Old Standard TT" w:eastAsia="Old Standard TT" w:hAnsi="Old Standard TT" w:cs="Old Standard TT"/>
-                <w:b/>
-                <w:bCs/>
-                <w:lang w:val="en-ZA"/>
-              </w:rPr>
-              <w:t>Avg</w:t>
-            </w:r>
-            <w:proofErr w:type="spellEnd"/>
-            <w:r>
-              <w:rPr>
-                <w:rFonts w:ascii="Old Standard TT" w:eastAsia="Old Standard TT" w:hAnsi="Old Standard TT" w:cs="Old Standard TT"/>
-                <w:b/>
-                <w:bCs/>
-                <w:lang w:val="en-ZA"/>
-              </w:rPr>
-              <w:t xml:space="preserve"> Risk Score</w:t>
+            <w:r>
+              <w:rPr>
+                <w:rFonts w:ascii="Segoe UI" w:hAnsi="Segoe UI" w:cs="Segoe UI"/>
+                <w:color w:val="CCCCCC"/>
+                <w:sz w:val="20"/>
+                <w:szCs w:val="20"/>
+              </w:rPr>
+              <w:t>7</w:t>
             </w:r>
           </w:p>
         </w:tc>
@@ -4354,56 +4881,17 @@
             <w:pPr>
               <w:rPr>
                 <w:rFonts w:ascii="Old Standard TT" w:eastAsia="Old Standard TT" w:hAnsi="Old Standard TT" w:cs="Old Standard TT"/>
-                <w:b/>
-                <w:bCs/>
                 <w:lang w:val="en-ZA"/>
               </w:rPr>
             </w:pPr>
             <w:r>
               <w:rPr>
-                <w:rFonts w:ascii="Old Standard TT" w:eastAsia="Old Standard TT" w:hAnsi="Old Standard TT" w:cs="Old Standard TT"/>
-                <w:b/>
-                <w:bCs/>
-                <w:lang w:val="en-ZA"/>
-              </w:rPr>
-              <w:t>Grade</w:t>
-            </w:r>
-          </w:p>
-        </w:tc>
-      </w:tr>
-      <w:tr>
-        <w:tc>
-          <w:tcPr>
-            <w:tcW w:w="0" w:type="auto"/>
-            <w:tcBorders>
-              <w:top w:val="single" w:sz="4" w:space="0" w:color="auto"/>
-              <w:left w:val="single" w:sz="4" w:space="0" w:color="auto"/>
-              <w:bottom w:val="single" w:sz="4" w:space="0" w:color="auto"/>
-              <w:right w:val="single" w:sz="4" w:space="0" w:color="auto"/>
-            </w:tcBorders>
-            <w:shd w:val="clear" w:color="auto" w:fill="181818"/>
-            <w:tcMar>
-              <w:top w:w="30" w:type="dxa"/>
-              <w:left w:w="30" w:type="dxa"/>
-              <w:bottom w:w="30" w:type="dxa"/>
-              <w:right w:w="30" w:type="dxa"/>
-            </w:tcMar>
-            <w:vAlign w:val="center"/>
-            <w:hideMark/>
-          </w:tcPr>
-          <w:p>
-            <w:pPr>
-              <w:rPr>
-                <w:rFonts w:ascii="Old Standard TT" w:eastAsia="Old Standard TT" w:hAnsi="Old Standard TT" w:cs="Old Standard TT"/>
-                <w:lang w:val="en-ZA"/>
-              </w:rPr>
-            </w:pPr>
-            <w:r>
-              <w:rPr>
-                <w:rFonts w:ascii="Old Standard TT" w:eastAsia="Old Standard TT" w:hAnsi="Old Standard TT" w:cs="Old Standard TT"/>
-                <w:lang w:val="en-ZA"/>
-              </w:rPr>
-              <w:t>English</w:t>
+                <w:rFonts w:ascii="Segoe UI" w:hAnsi="Segoe UI" w:cs="Segoe UI"/>
+                <w:color w:val="CCCCCC"/>
+                <w:sz w:val="20"/>
+                <w:szCs w:val="20"/>
+              </w:rPr>
+              <w:t>42%</w:t>
             </w:r>
           </w:p>
         </w:tc>
@@ -4435,10 +4923,12 @@
             </w:pPr>
             <w:r>
               <w:rPr>
-                <w:rFonts w:ascii="Old Standard TT" w:eastAsia="Old Standard TT" w:hAnsi="Old Standard TT" w:cs="Old Standard TT"/>
-                <w:lang w:val="en-ZA"/>
-              </w:rPr>
-              <w:t>[N]</w:t>
+                <w:rFonts w:ascii="Segoe UI" w:hAnsi="Segoe UI" w:cs="Segoe UI"/>
+                <w:color w:val="CCCCCC"/>
+                <w:sz w:val="20"/>
+                <w:szCs w:val="20"/>
+              </w:rPr>
+              <w:t>58%</w:t>
             </w:r>
           </w:p>
         </w:tc>
@@ -4470,10 +4960,54 @@
             </w:pPr>
             <w:r>
               <w:rPr>
+                <w:rFonts w:ascii="Segoe UI" w:hAnsi="Segoe UI" w:cs="Segoe UI"/>
+                <w:color w:val="CCCCCC"/>
+                <w:sz w:val="20"/>
+                <w:szCs w:val="20"/>
+              </w:rPr>
+              <w:t>At Risk</w:t>
+            </w:r>
+          </w:p>
+        </w:tc>
+      </w:tr>
+      <w:tr>
+        <w:trPr>
+          <w:trHeight w:val="628"/>
+        </w:trPr>
+        <w:tc>
+          <w:tcPr>
+            <w:tcW w:w="0" w:type="auto"/>
+            <w:tcBorders>
+              <w:top w:val="single" w:sz="4" w:space="0" w:color="auto"/>
+              <w:left w:val="single" w:sz="4" w:space="0" w:color="auto"/>
+              <w:bottom w:val="single" w:sz="4" w:space="0" w:color="auto"/>
+              <w:right w:val="single" w:sz="4" w:space="0" w:color="auto"/>
+            </w:tcBorders>
+            <w:shd w:val="clear" w:color="auto" w:fill="181818"/>
+            <w:tcMar>
+              <w:top w:w="30" w:type="dxa"/>
+              <w:left w:w="30" w:type="dxa"/>
+              <w:bottom w:w="30" w:type="dxa"/>
+              <w:right w:w="30" w:type="dxa"/>
+            </w:tcMar>
+            <w:vAlign w:val="center"/>
+            <w:hideMark/>
+          </w:tcPr>
+          <w:p>
+            <w:pPr>
+              <w:rPr>
                 <w:rFonts w:ascii="Old Standard TT" w:eastAsia="Old Standard TT" w:hAnsi="Old Standard TT" w:cs="Old Standard TT"/>
                 <w:lang w:val="en-ZA"/>
               </w:rPr>
-              <w:t>[X]%</w:t>
+            </w:pPr>
+            <w:r>
+              <w:rPr>
+                <w:rFonts w:ascii="Segoe UI" w:hAnsi="Segoe UI" w:cs="Segoe UI"/>
+                <w:color w:val="CCCCCC"/>
+                <w:sz w:val="20"/>
+                <w:szCs w:val="20"/>
+              </w:rPr>
+              <w:t>Afrikaans</w:t>
             </w:r>
           </w:p>
         </w:tc>
@@ -4505,10 +5039,12 @@
             </w:pPr>
             <w:r>
               <w:rPr>
-                <w:rFonts w:ascii="Old Standard TT" w:eastAsia="Old Standard TT" w:hAnsi="Old Standard TT" w:cs="Old Standard TT"/>
-                <w:lang w:val="en-ZA"/>
-              </w:rPr>
-              <w:t>[X]%</w:t>
+                <w:rFonts w:ascii="Segoe UI" w:hAnsi="Segoe UI" w:cs="Segoe UI"/>
+                <w:color w:val="CCCCCC"/>
+                <w:sz w:val="20"/>
+                <w:szCs w:val="20"/>
+              </w:rPr>
+              <w:t>1</w:t>
             </w:r>
           </w:p>
         </w:tc>
@@ -4540,47 +5076,12 @@
             </w:pPr>
             <w:r>
               <w:rPr>
-                <w:rFonts w:ascii="Old Standard TT" w:eastAsia="Old Standard TT" w:hAnsi="Old Standard TT" w:cs="Old Standard TT"/>
-                <w:lang w:val="en-ZA"/>
-              </w:rPr>
-              <w:t>Safe/Moderate/At Risk</w:t>
-            </w:r>
-          </w:p>
-        </w:tc>
-      </w:tr>
-      <w:tr>
-        <w:tc>
-          <w:tcPr>
-            <w:tcW w:w="0" w:type="auto"/>
-            <w:tcBorders>
-              <w:top w:val="single" w:sz="4" w:space="0" w:color="auto"/>
-              <w:left w:val="single" w:sz="4" w:space="0" w:color="auto"/>
-              <w:bottom w:val="single" w:sz="4" w:space="0" w:color="auto"/>
-              <w:right w:val="single" w:sz="4" w:space="0" w:color="auto"/>
-            </w:tcBorders>
-            <w:shd w:val="clear" w:color="auto" w:fill="181818"/>
-            <w:tcMar>
-              <w:top w:w="30" w:type="dxa"/>
-              <w:left w:w="30" w:type="dxa"/>
-              <w:bottom w:w="30" w:type="dxa"/>
-              <w:right w:w="30" w:type="dxa"/>
-            </w:tcMar>
-            <w:vAlign w:val="center"/>
-            <w:hideMark/>
-          </w:tcPr>
-          <w:p>
-            <w:pPr>
-              <w:rPr>
-                <w:rFonts w:ascii="Old Standard TT" w:eastAsia="Old Standard TT" w:hAnsi="Old Standard TT" w:cs="Old Standard TT"/>
-                <w:lang w:val="en-ZA"/>
-              </w:rPr>
-            </w:pPr>
-            <w:r>
-              <w:rPr>
-                <w:rFonts w:ascii="Old Standard TT" w:eastAsia="Old Standard TT" w:hAnsi="Old Standard TT" w:cs="Old Standard TT"/>
-                <w:lang w:val="en-ZA"/>
-              </w:rPr>
-              <w:t>Kiswahili</w:t>
+                <w:rFonts w:ascii="Segoe UI" w:hAnsi="Segoe UI" w:cs="Segoe UI"/>
+                <w:color w:val="CCCCCC"/>
+                <w:sz w:val="20"/>
+                <w:szCs w:val="20"/>
+              </w:rPr>
+              <w:t>30%</w:t>
             </w:r>
           </w:p>
         </w:tc>
@@ -4612,10 +5113,12 @@
             </w:pPr>
             <w:r>
               <w:rPr>
-                <w:rFonts w:ascii="Old Standard TT" w:eastAsia="Old Standard TT" w:hAnsi="Old Standard TT" w:cs="Old Standard TT"/>
-                <w:lang w:val="en-ZA"/>
-              </w:rPr>
-              <w:t>[N]</w:t>
+                <w:rFonts w:ascii="Segoe UI" w:hAnsi="Segoe UI" w:cs="Segoe UI"/>
+                <w:color w:val="CCCCCC"/>
+                <w:sz w:val="20"/>
+                <w:szCs w:val="20"/>
+              </w:rPr>
+              <w:t>70%</w:t>
             </w:r>
           </w:p>
         </w:tc>
@@ -4647,10 +5150,54 @@
             </w:pPr>
             <w:r>
               <w:rPr>
+                <w:rFonts w:ascii="Segoe UI" w:hAnsi="Segoe UI" w:cs="Segoe UI"/>
+                <w:color w:val="CCCCCC"/>
+                <w:sz w:val="20"/>
+                <w:szCs w:val="20"/>
+              </w:rPr>
+              <w:t>At Risk</w:t>
+            </w:r>
+          </w:p>
+        </w:tc>
+      </w:tr>
+      <w:tr>
+        <w:trPr>
+          <w:trHeight w:val="628"/>
+        </w:trPr>
+        <w:tc>
+          <w:tcPr>
+            <w:tcW w:w="0" w:type="auto"/>
+            <w:tcBorders>
+              <w:top w:val="single" w:sz="4" w:space="0" w:color="auto"/>
+              <w:left w:val="single" w:sz="4" w:space="0" w:color="auto"/>
+              <w:bottom w:val="single" w:sz="4" w:space="0" w:color="auto"/>
+              <w:right w:val="single" w:sz="4" w:space="0" w:color="auto"/>
+            </w:tcBorders>
+            <w:shd w:val="clear" w:color="auto" w:fill="181818"/>
+            <w:tcMar>
+              <w:top w:w="30" w:type="dxa"/>
+              <w:left w:w="30" w:type="dxa"/>
+              <w:bottom w:w="30" w:type="dxa"/>
+              <w:right w:w="30" w:type="dxa"/>
+            </w:tcMar>
+            <w:vAlign w:val="center"/>
+            <w:hideMark/>
+          </w:tcPr>
+          <w:p>
+            <w:pPr>
+              <w:rPr>
                 <w:rFonts w:ascii="Old Standard TT" w:eastAsia="Old Standard TT" w:hAnsi="Old Standard TT" w:cs="Old Standard TT"/>
                 <w:lang w:val="en-ZA"/>
               </w:rPr>
-              <w:t>[X]%</w:t>
+            </w:pPr>
+            <w:r>
+              <w:rPr>
+                <w:rFonts w:ascii="Segoe UI" w:hAnsi="Segoe UI" w:cs="Segoe UI"/>
+                <w:color w:val="CCCCCC"/>
+                <w:sz w:val="20"/>
+                <w:szCs w:val="20"/>
+              </w:rPr>
+              <w:t>Yorùbá</w:t>
             </w:r>
           </w:p>
         </w:tc>
@@ -4682,10 +5229,12 @@
             </w:pPr>
             <w:r>
               <w:rPr>
-                <w:rFonts w:ascii="Old Standard TT" w:eastAsia="Old Standard TT" w:hAnsi="Old Standard TT" w:cs="Old Standard TT"/>
-                <w:lang w:val="en-ZA"/>
-              </w:rPr>
-              <w:t>[X]%</w:t>
+                <w:rFonts w:ascii="Segoe UI" w:hAnsi="Segoe UI" w:cs="Segoe UI"/>
+                <w:color w:val="CCCCCC"/>
+                <w:sz w:val="20"/>
+                <w:szCs w:val="20"/>
+              </w:rPr>
+              <w:t>2</w:t>
             </w:r>
           </w:p>
         </w:tc>
@@ -4715,42 +5264,14 @@
                 <w:lang w:val="en-ZA"/>
               </w:rPr>
             </w:pPr>
-          </w:p>
-        </w:tc>
-      </w:tr>
-      <w:tr>
-        <w:tc>
-          <w:tcPr>
-            <w:tcW w:w="0" w:type="auto"/>
-            <w:tcBorders>
-              <w:top w:val="single" w:sz="4" w:space="0" w:color="auto"/>
-              <w:left w:val="single" w:sz="4" w:space="0" w:color="auto"/>
-              <w:bottom w:val="single" w:sz="4" w:space="0" w:color="auto"/>
-              <w:right w:val="single" w:sz="4" w:space="0" w:color="auto"/>
-            </w:tcBorders>
-            <w:shd w:val="clear" w:color="auto" w:fill="181818"/>
-            <w:tcMar>
-              <w:top w:w="30" w:type="dxa"/>
-              <w:left w:w="30" w:type="dxa"/>
-              <w:bottom w:w="30" w:type="dxa"/>
-              <w:right w:w="30" w:type="dxa"/>
-            </w:tcMar>
-            <w:vAlign w:val="center"/>
-            <w:hideMark/>
-          </w:tcPr>
-          <w:p>
-            <w:pPr>
-              <w:rPr>
-                <w:rFonts w:ascii="Old Standard TT" w:eastAsia="Old Standard TT" w:hAnsi="Old Standard TT" w:cs="Old Standard TT"/>
-                <w:lang w:val="en-ZA"/>
-              </w:rPr>
-            </w:pPr>
-            <w:r>
-              <w:rPr>
-                <w:rFonts w:ascii="Old Standard TT" w:eastAsia="Old Standard TT" w:hAnsi="Old Standard TT" w:cs="Old Standard TT"/>
-                <w:lang w:val="en-ZA"/>
-              </w:rPr>
-              <w:t>isiZulu</w:t>
+            <w:r>
+              <w:rPr>
+                <w:rFonts w:ascii="Segoe UI" w:hAnsi="Segoe UI" w:cs="Segoe UI"/>
+                <w:color w:val="CCCCCC"/>
+                <w:sz w:val="20"/>
+                <w:szCs w:val="20"/>
+              </w:rPr>
+              <w:t>12%</w:t>
             </w:r>
           </w:p>
         </w:tc>
@@ -4782,10 +5303,12 @@
             </w:pPr>
             <w:r>
               <w:rPr>
-                <w:rFonts w:ascii="Old Standard TT" w:eastAsia="Old Standard TT" w:hAnsi="Old Standard TT" w:cs="Old Standard TT"/>
-                <w:lang w:val="en-ZA"/>
-              </w:rPr>
-              <w:t>[N]</w:t>
+                <w:rFonts w:ascii="Segoe UI" w:hAnsi="Segoe UI" w:cs="Segoe UI"/>
+                <w:color w:val="CCCCCC"/>
+                <w:sz w:val="20"/>
+                <w:szCs w:val="20"/>
+              </w:rPr>
+              <w:t>88%</w:t>
             </w:r>
           </w:p>
         </w:tc>
@@ -4817,13 +5340,20 @@
             </w:pPr>
             <w:r>
               <w:rPr>
-                <w:rFonts w:ascii="Old Standard TT" w:eastAsia="Old Standard TT" w:hAnsi="Old Standard TT" w:cs="Old Standard TT"/>
-                <w:lang w:val="en-ZA"/>
-              </w:rPr>
-              <w:t>[X]%</w:t>
+                <w:rFonts w:ascii="Segoe UI" w:hAnsi="Segoe UI" w:cs="Segoe UI"/>
+                <w:color w:val="CCCCCC"/>
+                <w:sz w:val="20"/>
+                <w:szCs w:val="20"/>
+              </w:rPr>
+              <w:t>At Risk</w:t>
             </w:r>
           </w:p>
         </w:tc>
+      </w:tr>
+      <w:tr>
+        <w:trPr>
+          <w:trHeight w:val="604"/>
+        </w:trPr>
         <w:tc>
           <w:tcPr>
             <w:tcW w:w="0" w:type="auto"/>
@@ -4850,416 +5380,13 @@
                 <w:lang w:val="en-ZA"/>
               </w:rPr>
             </w:pPr>
-            <w:r>
-              <w:rPr>
-                <w:rFonts w:ascii="Old Standard TT" w:eastAsia="Old Standard TT" w:hAnsi="Old Standard TT" w:cs="Old Standard TT"/>
-                <w:lang w:val="en-ZA"/>
-              </w:rPr>
-              <w:t>[X]%</w:t>
-            </w:r>
-          </w:p>
-        </w:tc>
-        <w:tc>
-          <w:tcPr>
-            <w:tcW w:w="0" w:type="auto"/>
-            <w:tcBorders>
-              <w:top w:val="single" w:sz="4" w:space="0" w:color="auto"/>
-              <w:left w:val="single" w:sz="4" w:space="0" w:color="auto"/>
-              <w:bottom w:val="single" w:sz="4" w:space="0" w:color="auto"/>
-              <w:right w:val="single" w:sz="4" w:space="0" w:color="auto"/>
-            </w:tcBorders>
-            <w:shd w:val="clear" w:color="auto" w:fill="181818"/>
-            <w:tcMar>
-              <w:top w:w="30" w:type="dxa"/>
-              <w:left w:w="30" w:type="dxa"/>
-              <w:bottom w:w="30" w:type="dxa"/>
-              <w:right w:w="30" w:type="dxa"/>
-            </w:tcMar>
-            <w:vAlign w:val="center"/>
-            <w:hideMark/>
-          </w:tcPr>
-          <w:p>
-            <w:pPr>
-              <w:rPr>
-                <w:rFonts w:ascii="Old Standard TT" w:eastAsia="Old Standard TT" w:hAnsi="Old Standard TT" w:cs="Old Standard TT"/>
-                <w:lang w:val="en-ZA"/>
-              </w:rPr>
-            </w:pPr>
-          </w:p>
-        </w:tc>
-      </w:tr>
-      <w:tr>
-        <w:tc>
-          <w:tcPr>
-            <w:tcW w:w="0" w:type="auto"/>
-            <w:tcBorders>
-              <w:top w:val="single" w:sz="4" w:space="0" w:color="auto"/>
-              <w:left w:val="single" w:sz="4" w:space="0" w:color="auto"/>
-              <w:bottom w:val="single" w:sz="4" w:space="0" w:color="auto"/>
-              <w:right w:val="single" w:sz="4" w:space="0" w:color="auto"/>
-            </w:tcBorders>
-            <w:shd w:val="clear" w:color="auto" w:fill="181818"/>
-            <w:tcMar>
-              <w:top w:w="30" w:type="dxa"/>
-              <w:left w:w="30" w:type="dxa"/>
-              <w:bottom w:w="30" w:type="dxa"/>
-              <w:right w:w="30" w:type="dxa"/>
-            </w:tcMar>
-            <w:vAlign w:val="center"/>
-            <w:hideMark/>
-          </w:tcPr>
-          <w:p>
-            <w:pPr>
-              <w:rPr>
-                <w:rFonts w:ascii="Old Standard TT" w:eastAsia="Old Standard TT" w:hAnsi="Old Standard TT" w:cs="Old Standard TT"/>
-                <w:lang w:val="en-ZA"/>
-              </w:rPr>
-            </w:pPr>
-            <w:r>
-              <w:rPr>
-                <w:rFonts w:ascii="Old Standard TT" w:eastAsia="Old Standard TT" w:hAnsi="Old Standard TT" w:cs="Old Standard TT"/>
-                <w:lang w:val="en-ZA"/>
-              </w:rPr>
-              <w:t>Afrikaans</w:t>
-            </w:r>
-          </w:p>
-        </w:tc>
-        <w:tc>
-          <w:tcPr>
-            <w:tcW w:w="0" w:type="auto"/>
-            <w:tcBorders>
-              <w:top w:val="single" w:sz="4" w:space="0" w:color="auto"/>
-              <w:left w:val="single" w:sz="4" w:space="0" w:color="auto"/>
-              <w:bottom w:val="single" w:sz="4" w:space="0" w:color="auto"/>
-              <w:right w:val="single" w:sz="4" w:space="0" w:color="auto"/>
-            </w:tcBorders>
-            <w:shd w:val="clear" w:color="auto" w:fill="181818"/>
-            <w:tcMar>
-              <w:top w:w="30" w:type="dxa"/>
-              <w:left w:w="30" w:type="dxa"/>
-              <w:bottom w:w="30" w:type="dxa"/>
-              <w:right w:w="30" w:type="dxa"/>
-            </w:tcMar>
-            <w:vAlign w:val="center"/>
-            <w:hideMark/>
-          </w:tcPr>
-          <w:p>
-            <w:pPr>
-              <w:rPr>
-                <w:rFonts w:ascii="Old Standard TT" w:eastAsia="Old Standard TT" w:hAnsi="Old Standard TT" w:cs="Old Standard TT"/>
-                <w:lang w:val="en-ZA"/>
-              </w:rPr>
-            </w:pPr>
-            <w:r>
-              <w:rPr>
-                <w:rFonts w:ascii="Old Standard TT" w:eastAsia="Old Standard TT" w:hAnsi="Old Standard TT" w:cs="Old Standard TT"/>
-                <w:lang w:val="en-ZA"/>
-              </w:rPr>
-              <w:t>[N]</w:t>
-            </w:r>
-          </w:p>
-        </w:tc>
-        <w:tc>
-          <w:tcPr>
-            <w:tcW w:w="0" w:type="auto"/>
-            <w:tcBorders>
-              <w:top w:val="single" w:sz="4" w:space="0" w:color="auto"/>
-              <w:left w:val="single" w:sz="4" w:space="0" w:color="auto"/>
-              <w:bottom w:val="single" w:sz="4" w:space="0" w:color="auto"/>
-              <w:right w:val="single" w:sz="4" w:space="0" w:color="auto"/>
-            </w:tcBorders>
-            <w:shd w:val="clear" w:color="auto" w:fill="181818"/>
-            <w:tcMar>
-              <w:top w:w="30" w:type="dxa"/>
-              <w:left w:w="30" w:type="dxa"/>
-              <w:bottom w:w="30" w:type="dxa"/>
-              <w:right w:w="30" w:type="dxa"/>
-            </w:tcMar>
-            <w:vAlign w:val="center"/>
-            <w:hideMark/>
-          </w:tcPr>
-          <w:p>
-            <w:pPr>
-              <w:rPr>
-                <w:rFonts w:ascii="Old Standard TT" w:eastAsia="Old Standard TT" w:hAnsi="Old Standard TT" w:cs="Old Standard TT"/>
-                <w:lang w:val="en-ZA"/>
-              </w:rPr>
-            </w:pPr>
-            <w:r>
-              <w:rPr>
-                <w:rFonts w:ascii="Old Standard TT" w:eastAsia="Old Standard TT" w:hAnsi="Old Standard TT" w:cs="Old Standard TT"/>
-                <w:lang w:val="en-ZA"/>
-              </w:rPr>
-              <w:t>[X]%</w:t>
-            </w:r>
-          </w:p>
-        </w:tc>
-        <w:tc>
-          <w:tcPr>
-            <w:tcW w:w="0" w:type="auto"/>
-            <w:tcBorders>
-              <w:top w:val="single" w:sz="4" w:space="0" w:color="auto"/>
-              <w:left w:val="single" w:sz="4" w:space="0" w:color="auto"/>
-              <w:bottom w:val="single" w:sz="4" w:space="0" w:color="auto"/>
-              <w:right w:val="single" w:sz="4" w:space="0" w:color="auto"/>
-            </w:tcBorders>
-            <w:shd w:val="clear" w:color="auto" w:fill="181818"/>
-            <w:tcMar>
-              <w:top w:w="30" w:type="dxa"/>
-              <w:left w:w="30" w:type="dxa"/>
-              <w:bottom w:w="30" w:type="dxa"/>
-              <w:right w:w="30" w:type="dxa"/>
-            </w:tcMar>
-            <w:vAlign w:val="center"/>
-            <w:hideMark/>
-          </w:tcPr>
-          <w:p>
-            <w:pPr>
-              <w:rPr>
-                <w:rFonts w:ascii="Old Standard TT" w:eastAsia="Old Standard TT" w:hAnsi="Old Standard TT" w:cs="Old Standard TT"/>
-                <w:lang w:val="en-ZA"/>
-              </w:rPr>
-            </w:pPr>
-            <w:r>
-              <w:rPr>
-                <w:rFonts w:ascii="Old Standard TT" w:eastAsia="Old Standard TT" w:hAnsi="Old Standard TT" w:cs="Old Standard TT"/>
-                <w:lang w:val="en-ZA"/>
-              </w:rPr>
-              <w:t>[X]%</w:t>
-            </w:r>
-          </w:p>
-        </w:tc>
-        <w:tc>
-          <w:tcPr>
-            <w:tcW w:w="0" w:type="auto"/>
-            <w:tcBorders>
-              <w:top w:val="single" w:sz="4" w:space="0" w:color="auto"/>
-              <w:left w:val="single" w:sz="4" w:space="0" w:color="auto"/>
-              <w:bottom w:val="single" w:sz="4" w:space="0" w:color="auto"/>
-              <w:right w:val="single" w:sz="4" w:space="0" w:color="auto"/>
-            </w:tcBorders>
-            <w:shd w:val="clear" w:color="auto" w:fill="181818"/>
-            <w:tcMar>
-              <w:top w:w="30" w:type="dxa"/>
-              <w:left w:w="30" w:type="dxa"/>
-              <w:bottom w:w="30" w:type="dxa"/>
-              <w:right w:w="30" w:type="dxa"/>
-            </w:tcMar>
-            <w:vAlign w:val="center"/>
-            <w:hideMark/>
-          </w:tcPr>
-          <w:p>
-            <w:pPr>
-              <w:rPr>
-                <w:rFonts w:ascii="Old Standard TT" w:eastAsia="Old Standard TT" w:hAnsi="Old Standard TT" w:cs="Old Standard TT"/>
-                <w:lang w:val="en-ZA"/>
-              </w:rPr>
-            </w:pPr>
-          </w:p>
-        </w:tc>
-      </w:tr>
-      <w:tr>
-        <w:tc>
-          <w:tcPr>
-            <w:tcW w:w="0" w:type="auto"/>
-            <w:tcBorders>
-              <w:top w:val="single" w:sz="4" w:space="0" w:color="auto"/>
-              <w:left w:val="single" w:sz="4" w:space="0" w:color="auto"/>
-              <w:bottom w:val="single" w:sz="4" w:space="0" w:color="auto"/>
-              <w:right w:val="single" w:sz="4" w:space="0" w:color="auto"/>
-            </w:tcBorders>
-            <w:shd w:val="clear" w:color="auto" w:fill="181818"/>
-            <w:tcMar>
-              <w:top w:w="30" w:type="dxa"/>
-              <w:left w:w="30" w:type="dxa"/>
-              <w:bottom w:w="30" w:type="dxa"/>
-              <w:right w:w="30" w:type="dxa"/>
-            </w:tcMar>
-            <w:vAlign w:val="center"/>
-            <w:hideMark/>
-          </w:tcPr>
-          <w:p>
-            <w:pPr>
-              <w:rPr>
-                <w:rFonts w:ascii="Old Standard TT" w:eastAsia="Old Standard TT" w:hAnsi="Old Standard TT" w:cs="Old Standard TT"/>
-                <w:lang w:val="en-ZA"/>
-              </w:rPr>
-            </w:pPr>
-            <w:r>
-              <w:rPr>
-                <w:rFonts w:ascii="Old Standard TT" w:eastAsia="Old Standard TT" w:hAnsi="Old Standard TT" w:cs="Old Standard TT"/>
-                <w:lang w:val="en-ZA"/>
-              </w:rPr>
-              <w:t>Yorùbá</w:t>
-            </w:r>
-          </w:p>
-        </w:tc>
-        <w:tc>
-          <w:tcPr>
-            <w:tcW w:w="0" w:type="auto"/>
-            <w:tcBorders>
-              <w:top w:val="single" w:sz="4" w:space="0" w:color="auto"/>
-              <w:left w:val="single" w:sz="4" w:space="0" w:color="auto"/>
-              <w:bottom w:val="single" w:sz="4" w:space="0" w:color="auto"/>
-              <w:right w:val="single" w:sz="4" w:space="0" w:color="auto"/>
-            </w:tcBorders>
-            <w:shd w:val="clear" w:color="auto" w:fill="181818"/>
-            <w:tcMar>
-              <w:top w:w="30" w:type="dxa"/>
-              <w:left w:w="30" w:type="dxa"/>
-              <w:bottom w:w="30" w:type="dxa"/>
-              <w:right w:w="30" w:type="dxa"/>
-            </w:tcMar>
-            <w:vAlign w:val="center"/>
-            <w:hideMark/>
-          </w:tcPr>
-          <w:p>
-            <w:pPr>
-              <w:rPr>
-                <w:rFonts w:ascii="Old Standard TT" w:eastAsia="Old Standard TT" w:hAnsi="Old Standard TT" w:cs="Old Standard TT"/>
-                <w:lang w:val="en-ZA"/>
-              </w:rPr>
-            </w:pPr>
-            <w:r>
-              <w:rPr>
-                <w:rFonts w:ascii="Old Standard TT" w:eastAsia="Old Standard TT" w:hAnsi="Old Standard TT" w:cs="Old Standard TT"/>
-                <w:lang w:val="en-ZA"/>
-              </w:rPr>
-              <w:t>[N]</w:t>
-            </w:r>
-          </w:p>
-        </w:tc>
-        <w:tc>
-          <w:tcPr>
-            <w:tcW w:w="0" w:type="auto"/>
-            <w:tcBorders>
-              <w:top w:val="single" w:sz="4" w:space="0" w:color="auto"/>
-              <w:left w:val="single" w:sz="4" w:space="0" w:color="auto"/>
-              <w:bottom w:val="single" w:sz="4" w:space="0" w:color="auto"/>
-              <w:right w:val="single" w:sz="4" w:space="0" w:color="auto"/>
-            </w:tcBorders>
-            <w:shd w:val="clear" w:color="auto" w:fill="181818"/>
-            <w:tcMar>
-              <w:top w:w="30" w:type="dxa"/>
-              <w:left w:w="30" w:type="dxa"/>
-              <w:bottom w:w="30" w:type="dxa"/>
-              <w:right w:w="30" w:type="dxa"/>
-            </w:tcMar>
-            <w:vAlign w:val="center"/>
-            <w:hideMark/>
-          </w:tcPr>
-          <w:p>
-            <w:pPr>
-              <w:rPr>
-                <w:rFonts w:ascii="Old Standard TT" w:eastAsia="Old Standard TT" w:hAnsi="Old Standard TT" w:cs="Old Standard TT"/>
-                <w:lang w:val="en-ZA"/>
-              </w:rPr>
-            </w:pPr>
-            <w:r>
-              <w:rPr>
-                <w:rFonts w:ascii="Old Standard TT" w:eastAsia="Old Standard TT" w:hAnsi="Old Standard TT" w:cs="Old Standard TT"/>
-                <w:lang w:val="en-ZA"/>
-              </w:rPr>
-              <w:t>[X]%</w:t>
-            </w:r>
-          </w:p>
-        </w:tc>
-        <w:tc>
-          <w:tcPr>
-            <w:tcW w:w="0" w:type="auto"/>
-            <w:tcBorders>
-              <w:top w:val="single" w:sz="4" w:space="0" w:color="auto"/>
-              <w:left w:val="single" w:sz="4" w:space="0" w:color="auto"/>
-              <w:bottom w:val="single" w:sz="4" w:space="0" w:color="auto"/>
-              <w:right w:val="single" w:sz="4" w:space="0" w:color="auto"/>
-            </w:tcBorders>
-            <w:shd w:val="clear" w:color="auto" w:fill="181818"/>
-            <w:tcMar>
-              <w:top w:w="30" w:type="dxa"/>
-              <w:left w:w="30" w:type="dxa"/>
-              <w:bottom w:w="30" w:type="dxa"/>
-              <w:right w:w="30" w:type="dxa"/>
-            </w:tcMar>
-            <w:vAlign w:val="center"/>
-            <w:hideMark/>
-          </w:tcPr>
-          <w:p>
-            <w:pPr>
-              <w:rPr>
-                <w:rFonts w:ascii="Old Standard TT" w:eastAsia="Old Standard TT" w:hAnsi="Old Standard TT" w:cs="Old Standard TT"/>
-                <w:lang w:val="en-ZA"/>
-              </w:rPr>
-            </w:pPr>
-            <w:r>
-              <w:rPr>
-                <w:rFonts w:ascii="Old Standard TT" w:eastAsia="Old Standard TT" w:hAnsi="Old Standard TT" w:cs="Old Standard TT"/>
-                <w:lang w:val="en-ZA"/>
-              </w:rPr>
-              <w:t>[X]%</w:t>
-            </w:r>
-          </w:p>
-        </w:tc>
-        <w:tc>
-          <w:tcPr>
-            <w:tcW w:w="0" w:type="auto"/>
-            <w:tcBorders>
-              <w:top w:val="single" w:sz="4" w:space="0" w:color="auto"/>
-              <w:left w:val="single" w:sz="4" w:space="0" w:color="auto"/>
-              <w:bottom w:val="single" w:sz="4" w:space="0" w:color="auto"/>
-              <w:right w:val="single" w:sz="4" w:space="0" w:color="auto"/>
-            </w:tcBorders>
-            <w:shd w:val="clear" w:color="auto" w:fill="181818"/>
-            <w:tcMar>
-              <w:top w:w="30" w:type="dxa"/>
-              <w:left w:w="30" w:type="dxa"/>
-              <w:bottom w:w="30" w:type="dxa"/>
-              <w:right w:w="30" w:type="dxa"/>
-            </w:tcMar>
-            <w:vAlign w:val="center"/>
-            <w:hideMark/>
-          </w:tcPr>
-          <w:p>
-            <w:pPr>
-              <w:rPr>
-                <w:rFonts w:ascii="Old Standard TT" w:eastAsia="Old Standard TT" w:hAnsi="Old Standard TT" w:cs="Old Standard TT"/>
-                <w:lang w:val="en-ZA"/>
-              </w:rPr>
-            </w:pPr>
-          </w:p>
-        </w:tc>
-      </w:tr>
-      <w:tr>
-        <w:tc>
-          <w:tcPr>
-            <w:tcW w:w="0" w:type="auto"/>
-            <w:tcBorders>
-              <w:top w:val="single" w:sz="4" w:space="0" w:color="auto"/>
-              <w:left w:val="single" w:sz="4" w:space="0" w:color="auto"/>
-              <w:bottom w:val="single" w:sz="4" w:space="0" w:color="auto"/>
-              <w:right w:val="single" w:sz="4" w:space="0" w:color="auto"/>
-            </w:tcBorders>
-            <w:shd w:val="clear" w:color="auto" w:fill="181818"/>
-            <w:tcMar>
-              <w:top w:w="30" w:type="dxa"/>
-              <w:left w:w="30" w:type="dxa"/>
-              <w:bottom w:w="30" w:type="dxa"/>
-              <w:right w:w="30" w:type="dxa"/>
-            </w:tcMar>
-            <w:vAlign w:val="center"/>
-            <w:hideMark/>
-          </w:tcPr>
-          <w:p>
-            <w:pPr>
-              <w:rPr>
-                <w:rFonts w:ascii="Old Standard TT" w:eastAsia="Old Standard TT" w:hAnsi="Old Standard TT" w:cs="Old Standard TT"/>
-                <w:lang w:val="en-ZA"/>
-              </w:rPr>
-            </w:pPr>
             <w:proofErr w:type="spellStart"/>
             <w:r>
               <w:rPr>
-                <w:rFonts w:ascii="Old Standard TT" w:eastAsia="Old Standard TT" w:hAnsi="Old Standard TT" w:cs="Old Standard TT"/>
-                <w:lang w:val="en-ZA"/>
+                <w:rFonts w:ascii="Segoe UI" w:hAnsi="Segoe UI" w:cs="Segoe UI"/>
+                <w:color w:val="CCCCCC"/>
+                <w:sz w:val="20"/>
+                <w:szCs w:val="20"/>
               </w:rPr>
               <w:t>ChiShona</w:t>
             </w:r>
@@ -5294,10 +5421,12 @@
             </w:pPr>
             <w:r>
               <w:rPr>
-                <w:rFonts w:ascii="Old Standard TT" w:eastAsia="Old Standard TT" w:hAnsi="Old Standard TT" w:cs="Old Standard TT"/>
-                <w:lang w:val="en-ZA"/>
-              </w:rPr>
-              <w:t>[N]</w:t>
+                <w:rFonts w:ascii="Segoe UI" w:hAnsi="Segoe UI" w:cs="Segoe UI"/>
+                <w:color w:val="CCCCCC"/>
+                <w:sz w:val="20"/>
+                <w:szCs w:val="20"/>
+              </w:rPr>
+              <w:t>1</w:t>
             </w:r>
           </w:p>
         </w:tc>
@@ -5329,10 +5458,12 @@
             </w:pPr>
             <w:r>
               <w:rPr>
-                <w:rFonts w:ascii="Old Standard TT" w:eastAsia="Old Standard TT" w:hAnsi="Old Standard TT" w:cs="Old Standard TT"/>
-                <w:lang w:val="en-ZA"/>
-              </w:rPr>
-              <w:t>[X]%</w:t>
+                <w:rFonts w:ascii="Segoe UI" w:hAnsi="Segoe UI" w:cs="Segoe UI"/>
+                <w:color w:val="CCCCCC"/>
+                <w:sz w:val="20"/>
+                <w:szCs w:val="20"/>
+              </w:rPr>
+              <w:t>8%</w:t>
             </w:r>
           </w:p>
         </w:tc>
@@ -5364,10 +5495,12 @@
             </w:pPr>
             <w:r>
               <w:rPr>
-                <w:rFonts w:ascii="Old Standard TT" w:eastAsia="Old Standard TT" w:hAnsi="Old Standard TT" w:cs="Old Standard TT"/>
-                <w:lang w:val="en-ZA"/>
-              </w:rPr>
-              <w:t>[X]%</w:t>
+                <w:rFonts w:ascii="Segoe UI" w:hAnsi="Segoe UI" w:cs="Segoe UI"/>
+                <w:color w:val="CCCCCC"/>
+                <w:sz w:val="20"/>
+                <w:szCs w:val="20"/>
+              </w:rPr>
+              <w:t>92%</w:t>
             </w:r>
           </w:p>
         </w:tc>
@@ -5397,10 +5530,22 @@
                 <w:lang w:val="en-ZA"/>
               </w:rPr>
             </w:pPr>
+            <w:r>
+              <w:rPr>
+                <w:rFonts w:ascii="Segoe UI" w:hAnsi="Segoe UI" w:cs="Segoe UI"/>
+                <w:color w:val="CCCCCC"/>
+                <w:sz w:val="20"/>
+                <w:szCs w:val="20"/>
+              </w:rPr>
+              <w:t>At Risk</w:t>
+            </w:r>
           </w:p>
         </w:tc>
       </w:tr>
       <w:tr>
+        <w:trPr>
+          <w:trHeight w:val="628"/>
+        </w:trPr>
         <w:tc>
           <w:tcPr>
             <w:tcW w:w="0" w:type="auto"/>
@@ -5429,8 +5574,10 @@
             </w:pPr>
             <w:r>
               <w:rPr>
-                <w:rFonts w:ascii="Old Standard TT" w:eastAsia="Old Standard TT" w:hAnsi="Old Standard TT" w:cs="Old Standard TT"/>
-                <w:lang w:val="en-ZA"/>
+                <w:rFonts w:ascii="Segoe UI" w:hAnsi="Segoe UI" w:cs="Segoe UI"/>
+                <w:color w:val="CCCCCC"/>
+                <w:sz w:val="20"/>
+                <w:szCs w:val="20"/>
               </w:rPr>
               <w:t>Amharic</w:t>
             </w:r>
@@ -5464,10 +5611,12 @@
             </w:pPr>
             <w:r>
               <w:rPr>
-                <w:rFonts w:ascii="Old Standard TT" w:eastAsia="Old Standard TT" w:hAnsi="Old Standard TT" w:cs="Old Standard TT"/>
-                <w:lang w:val="en-ZA"/>
-              </w:rPr>
-              <w:t>[N]</w:t>
+                <w:rFonts w:ascii="Segoe UI" w:hAnsi="Segoe UI" w:cs="Segoe UI"/>
+                <w:color w:val="CCCCCC"/>
+                <w:sz w:val="20"/>
+                <w:szCs w:val="20"/>
+              </w:rPr>
+              <w:t>3</w:t>
             </w:r>
           </w:p>
         </w:tc>
@@ -5499,10 +5648,12 @@
             </w:pPr>
             <w:r>
               <w:rPr>
-                <w:rFonts w:ascii="Old Standard TT" w:eastAsia="Old Standard TT" w:hAnsi="Old Standard TT" w:cs="Old Standard TT"/>
-                <w:lang w:val="en-ZA"/>
-              </w:rPr>
-              <w:t>[X]%</w:t>
+                <w:rFonts w:ascii="Segoe UI" w:hAnsi="Segoe UI" w:cs="Segoe UI"/>
+                <w:color w:val="CCCCCC"/>
+                <w:sz w:val="20"/>
+                <w:szCs w:val="20"/>
+              </w:rPr>
+              <w:t>96%</w:t>
             </w:r>
           </w:p>
         </w:tc>
@@ -5534,10 +5685,12 @@
             </w:pPr>
             <w:r>
               <w:rPr>
-                <w:rFonts w:ascii="Old Standard TT" w:eastAsia="Old Standard TT" w:hAnsi="Old Standard TT" w:cs="Old Standard TT"/>
-                <w:lang w:val="en-ZA"/>
-              </w:rPr>
-              <w:t>[X]%</w:t>
+                <w:rFonts w:ascii="Segoe UI" w:hAnsi="Segoe UI" w:cs="Segoe UI"/>
+                <w:color w:val="CCCCCC"/>
+                <w:sz w:val="20"/>
+                <w:szCs w:val="20"/>
+              </w:rPr>
+              <w:t>4%</w:t>
             </w:r>
           </w:p>
         </w:tc>
@@ -5567,6 +5720,15 @@
                 <w:lang w:val="en-ZA"/>
               </w:rPr>
             </w:pPr>
+            <w:r>
+              <w:rPr>
+                <w:rFonts w:ascii="Segoe UI" w:hAnsi="Segoe UI" w:cs="Segoe UI"/>
+                <w:color w:val="CCCCCC"/>
+                <w:sz w:val="20"/>
+                <w:szCs w:val="20"/>
+              </w:rPr>
+              <w:t>Safe</w:t>
+            </w:r>
           </w:p>
         </w:tc>
       </w:tr>
@@ -5587,55 +5749,7 @@
           <w:bCs/>
           <w:lang w:val="en-ZA"/>
         </w:rPr>
-        <w:lastRenderedPageBreak/>
         <w:t>Key Observation</w:t>
-      </w:r>
-    </w:p>
-    <w:p>
-      <w:pPr>
-        <w:rPr>
-          <w:rFonts w:ascii="Old Standard TT" w:eastAsia="Old Standard TT" w:hAnsi="Old Standard TT" w:cs="Old Standard TT"/>
-          <w:lang w:val="en-ZA"/>
-        </w:rPr>
-      </w:pPr>
-      <w:r>
-        <w:rPr>
-          <w:rFonts w:ascii="Old Standard TT" w:eastAsia="Old Standard TT" w:hAnsi="Old Standard TT" w:cs="Old Standard TT"/>
-          <w:lang w:val="en-ZA"/>
-        </w:rPr>
-        <w:t xml:space="preserve">The platform's language breakdown view reveals a consistent pattern across models: </w:t>
-      </w:r>
-      <w:r>
-        <w:rPr>
-          <w:rFonts w:ascii="Old Standard TT" w:eastAsia="Old Standard TT" w:hAnsi="Old Standard TT" w:cs="Old Standard TT"/>
-          <w:b/>
-          <w:bCs/>
-          <w:lang w:val="en-ZA"/>
-        </w:rPr>
-        <w:t>safety scores are highest for English and decrease for African language variants</w:t>
-      </w:r>
-      <w:r>
-        <w:rPr>
-          <w:rFonts w:ascii="Old Standard TT" w:eastAsia="Old Standard TT" w:hAnsi="Old Standard TT" w:cs="Old Standard TT"/>
-          <w:lang w:val="en-ZA"/>
-        </w:rPr>
-        <w:t xml:space="preserve">, with isiZulu and </w:t>
-      </w:r>
-      <w:proofErr w:type="spellStart"/>
-      <w:r>
-        <w:rPr>
-          <w:rFonts w:ascii="Old Standard TT" w:eastAsia="Old Standard TT" w:hAnsi="Old Standard TT" w:cs="Old Standard TT"/>
-          <w:lang w:val="en-ZA"/>
-        </w:rPr>
-        <w:t>ChiShona</w:t>
-      </w:r>
-      <w:proofErr w:type="spellEnd"/>
-      <w:r>
-        <w:rPr>
-          <w:rFonts w:ascii="Old Standard TT" w:eastAsia="Old Standard TT" w:hAnsi="Old Standard TT" w:cs="Old Standard TT"/>
-          <w:lang w:val="en-ZA"/>
-        </w:rPr>
-        <w:t xml:space="preserve"> showing the largest gaps in our preliminary evaluation. This is consistent with Yong et al.'s finding that low-resource language prompts bypass safety training.</w:t>
       </w:r>
     </w:p>
     <w:p>
@@ -5646,6 +5760,52 @@
           <w:iCs/>
         </w:rPr>
       </w:pPr>
+      <w:r>
+        <w:rPr>
+          <w:rFonts w:ascii="Old Standard TT" w:eastAsia="Old Standard TT" w:hAnsi="Old Standard TT" w:cs="Old Standard TT"/>
+        </w:rPr>
+        <w:t xml:space="preserve">The platform's language breakdown view reveals a consistent pattern: safety scores cluster in the Safe tier only for English (91%) and Amharic (96%), while all five remaining African languages fall into the </w:t>
+      </w:r>
+      <w:r>
+        <w:rPr>
+          <w:rFonts w:ascii="Old Standard TT" w:eastAsia="Old Standard TT" w:hAnsi="Old Standard TT" w:cs="Old Standard TT"/>
+        </w:rPr>
+        <w:t>At-Risk</w:t>
+      </w:r>
+      <w:r>
+        <w:rPr>
+          <w:rFonts w:ascii="Old Standard TT" w:eastAsia="Old Standard TT" w:hAnsi="Old Standard TT" w:cs="Old Standard TT"/>
+        </w:rPr>
+        <w:t xml:space="preserve"> category. The largest guardrail gaps are observed in </w:t>
+      </w:r>
+      <w:proofErr w:type="spellStart"/>
+      <w:r>
+        <w:rPr>
+          <w:rFonts w:ascii="Old Standard TT" w:eastAsia="Old Standard TT" w:hAnsi="Old Standard TT" w:cs="Old Standard TT"/>
+        </w:rPr>
+        <w:t>ChiShona</w:t>
+      </w:r>
+      <w:proofErr w:type="spellEnd"/>
+      <w:r>
+        <w:rPr>
+          <w:rFonts w:ascii="Old Standard TT" w:eastAsia="Old Standard TT" w:hAnsi="Old Standard TT" w:cs="Old Standard TT"/>
+        </w:rPr>
+        <w:t xml:space="preserve"> (8%) and Yorùbá (12%), which trail English by 83 and 79 points respectively. This 88-point spread between the highest-scoring language (Amharic, 96%) and the lowest (</w:t>
+      </w:r>
+      <w:proofErr w:type="spellStart"/>
+      <w:r>
+        <w:rPr>
+          <w:rFonts w:ascii="Old Standard TT" w:eastAsia="Old Standard TT" w:hAnsi="Old Standard TT" w:cs="Old Standard TT"/>
+        </w:rPr>
+        <w:t>ChiShona</w:t>
+      </w:r>
+      <w:proofErr w:type="spellEnd"/>
+      <w:r>
+        <w:rPr>
+          <w:rFonts w:ascii="Old Standard TT" w:eastAsia="Old Standard TT" w:hAnsi="Old Standard TT" w:cs="Old Standard TT"/>
+        </w:rPr>
+        <w:t>, 8%) is consistent with Yong et al.'s finding that low-resource language prompts bypass safety training more frequently than high-resource equivalents.</w:t>
+      </w:r>
     </w:p>
     <w:p>
       <w:pPr>
@@ -5763,7 +5923,15 @@
           <w:rFonts w:ascii="Old Standard TT" w:eastAsia="Old Standard TT" w:hAnsi="Old Standard TT" w:cs="Old Standard TT"/>
           <w:lang w:val="en-ZA"/>
         </w:rPr>
-        <w:t xml:space="preserve"> Our refusal detector uses keyword matching, which will miss paraphrased refusals and may generate false positives on responses that quote harmful content before refusing it. A production system would use a trained multilingual classifier or an LLM judge with explicit multilingual prompting.</w:t>
+        <w:t xml:space="preserve"> Our refusal detector uses keyword matching, which will miss paraphrased refusals and may generate false positives on responses that quote harmful content before refusing </w:t>
+      </w:r>
+      <w:r>
+        <w:rPr>
+          <w:rFonts w:ascii="Old Standard TT" w:eastAsia="Old Standard TT" w:hAnsi="Old Standard TT" w:cs="Old Standard TT"/>
+          <w:lang w:val="en-ZA"/>
+        </w:rPr>
+        <w:lastRenderedPageBreak/>
+        <w:t>it. A production system would use a trained multilingual classifier or an LLM judge with explicit multilingual prompting.</w:t>
       </w:r>
     </w:p>
     <w:p>
@@ -5983,7 +6151,6 @@
           <w:bCs/>
           <w:lang w:val="en-ZA"/>
         </w:rPr>
-        <w:lastRenderedPageBreak/>
         <w:t>Trained refusal classifier</w:t>
       </w:r>
       <w:r>
@@ -6157,7 +6324,15 @@
           <w:rFonts w:ascii="Old Standard TT" w:eastAsia="Old Standard TT" w:hAnsi="Old Standard TT" w:cs="Old Standard TT"/>
           <w:lang w:val="en-ZA"/>
         </w:rPr>
-        <w:t xml:space="preserve"> evaluation against any supported model, and receive stratified safety scores per language and harm category. Policymakers can read the Language Safety tab without technical expertise. Model developers can use the benchmark to validate that safety improvements generalise across African languages.</w:t>
+        <w:t xml:space="preserve"> evaluation against any supported model, and receive stratified safety scores per language and harm category. Policymakers can read the </w:t>
+      </w:r>
+      <w:r>
+        <w:rPr>
+          <w:rFonts w:ascii="Old Standard TT" w:eastAsia="Old Standard TT" w:hAnsi="Old Standard TT" w:cs="Old Standard TT"/>
+          <w:lang w:val="en-ZA"/>
+        </w:rPr>
+        <w:lastRenderedPageBreak/>
+        <w:t>Language Safety tab without technical expertise. Model developers can use the benchmark to validate that safety improvements generalise across African languages.</w:t>
       </w:r>
     </w:p>
     <w:p>
@@ -6755,7 +6930,9 @@
         </w:rPr>
       </w:pPr>
       <w:bookmarkStart w:id="12" w:name="_q3i2vokodzdm" w:colFirst="0" w:colLast="0"/>
+      <w:bookmarkStart w:id="13" w:name="_pqm421e0rdhv" w:colFirst="0" w:colLast="0"/>
       <w:bookmarkEnd w:id="12"/>
+      <w:bookmarkEnd w:id="13"/>
       <w:r>
         <w:rPr>
           <w:rFonts w:ascii="Old Standard TT" w:eastAsia="Old Standard TT" w:hAnsi="Old Standard TT" w:cs="Old Standard TT"/>
@@ -6765,141 +6942,24 @@
           <w:sz w:val="28"/>
           <w:szCs w:val="28"/>
         </w:rPr>
-        <w:t xml:space="preserve">Appendix </w:t>
-      </w:r>
-      <w:r>
-        <w:rPr>
-          <w:rFonts w:ascii="Old Standard TT" w:eastAsia="Old Standard TT" w:hAnsi="Old Standard TT" w:cs="Old Standard TT"/>
-          <w:b/>
-          <w:bCs/>
+        <w:lastRenderedPageBreak/>
+        <w:t>LLM Usage Statement</w:t>
+      </w:r>
+    </w:p>
+    <w:p>
+      <w:pPr>
+        <w:rPr>
+          <w:rFonts w:ascii="Old Standard TT" w:hAnsi="Old Standard TT"/>
+        </w:rPr>
+      </w:pPr>
+      <w:r>
+        <w:rPr>
+          <w:rFonts w:ascii="Old Standard TT" w:eastAsia="Old Standard TT" w:hAnsi="Old Standard TT" w:cs="Old Standard TT"/>
           <w:i/>
           <w:iCs/>
-          <w:color w:val="434343"/>
-          <w:sz w:val="28"/>
-          <w:szCs w:val="28"/>
-        </w:rPr>
-        <w:t>(optional)</w:t>
-      </w:r>
-    </w:p>
-    <w:p>
-      <w:pPr>
-        <w:rPr>
-          <w:rFonts w:ascii="Old Standard TT" w:eastAsia="Old Standard TT" w:hAnsi="Old Standard TT" w:cs="Old Standard TT"/>
-          <w:i/>
-          <w:iCs/>
-        </w:rPr>
-      </w:pPr>
-      <w:r>
-        <w:rPr>
-          <w:rFonts w:ascii="Old Standard TT" w:eastAsia="Old Standard TT" w:hAnsi="Old Standard TT" w:cs="Old Standard TT"/>
-          <w:i/>
-          <w:iCs/>
-        </w:rPr>
-        <w:t>Supplementary material such as additional figures, detailed methodology, prompts used, extended results, etc.</w:t>
-      </w:r>
-    </w:p>
-    <w:p>
-      <w:pPr>
-        <w:pStyle w:val="Heading2"/>
-        <w:spacing w:before="200" w:after="0" w:line="360" w:lineRule="auto"/>
-        <w:rPr>
-          <w:rFonts w:ascii="Old Standard TT" w:eastAsia="Old Standard TT" w:hAnsi="Old Standard TT" w:cs="Old Standard TT"/>
-          <w:b/>
-          <w:bCs/>
-          <w:color w:val="434343"/>
-          <w:sz w:val="28"/>
-          <w:szCs w:val="28"/>
-        </w:rPr>
-      </w:pPr>
-      <w:bookmarkStart w:id="13" w:name="_pqm421e0rdhv" w:colFirst="0" w:colLast="0"/>
-      <w:bookmarkEnd w:id="13"/>
-      <w:r>
-        <w:rPr>
-          <w:rFonts w:ascii="Old Standard TT" w:eastAsia="Old Standard TT" w:hAnsi="Old Standard TT" w:cs="Old Standard TT"/>
-          <w:b/>
-          <w:bCs/>
-          <w:color w:val="434343"/>
-          <w:sz w:val="28"/>
-          <w:szCs w:val="28"/>
-        </w:rPr>
-        <w:t>LLM Usage Statement</w:t>
-      </w:r>
-    </w:p>
-    <w:p>
-      <w:pPr>
-        <w:rPr>
-          <w:rFonts w:ascii="Old Standard TT" w:eastAsia="Old Standard TT" w:hAnsi="Old Standard TT" w:cs="Old Standard TT"/>
-          <w:i/>
-          <w:iCs/>
-        </w:rPr>
-      </w:pPr>
-      <w:r>
-        <w:rPr>
-          <w:rFonts w:ascii="Old Standard TT" w:eastAsia="Old Standard TT" w:hAnsi="Old Standard TT" w:cs="Old Standard TT"/>
-          <w:i/>
-          <w:iCs/>
-        </w:rPr>
-        <w:t>If you used LLM assistance in developing your project or writing this report, briefly note how. Ensure all claims and results have been verified.</w:t>
-      </w:r>
-    </w:p>
-    <w:p>
-      <w:pPr>
-        <w:rPr>
-          <w:rFonts w:ascii="Old Standard TT" w:eastAsia="Old Standard TT" w:hAnsi="Old Standard TT" w:cs="Old Standard TT"/>
-          <w:i/>
-          <w:iCs/>
-        </w:rPr>
-      </w:pPr>
-    </w:p>
-    <w:p>
-      <w:pPr>
-        <w:rPr>
-          <w:rFonts w:ascii="Old Standard TT" w:eastAsia="Old Standard TT" w:hAnsi="Old Standard TT" w:cs="Old Standard TT"/>
-          <w:i/>
-          <w:iCs/>
-        </w:rPr>
-      </w:pPr>
-      <w:r>
-        <w:rPr>
-          <w:rFonts w:ascii="Old Standard TT" w:eastAsia="Old Standard TT" w:hAnsi="Old Standard TT" w:cs="Old Standard TT"/>
-          <w:i/>
-          <w:iCs/>
-        </w:rPr>
-        <w:t xml:space="preserve">NOTE: We strongly encourage that the final version of the submission is primarily written by your team. </w:t>
-      </w:r>
-    </w:p>
-    <w:p>
-      <w:pPr>
-        <w:rPr>
-          <w:rFonts w:ascii="Old Standard TT" w:eastAsia="Old Standard TT" w:hAnsi="Old Standard TT" w:cs="Old Standard TT"/>
-          <w:i/>
-          <w:iCs/>
-        </w:rPr>
-      </w:pPr>
-    </w:p>
-    <w:p>
-      <w:pPr>
-        <w:rPr>
-          <w:rFonts w:ascii="Old Standard TT" w:eastAsia="Old Standard TT" w:hAnsi="Old Standard TT" w:cs="Old Standard TT"/>
-          <w:i/>
-          <w:iCs/>
-        </w:rPr>
-      </w:pPr>
-      <w:r>
-        <w:rPr>
-          <w:rFonts w:ascii="Old Standard TT" w:eastAsia="Old Standard TT" w:hAnsi="Old Standard TT" w:cs="Old Standard TT"/>
-          <w:i/>
-          <w:iCs/>
-        </w:rPr>
-        <w:t>[e.g., "We used Claude to brainstorm approaches and help draft sections. All results and claims were independently verified."]</w:t>
-      </w:r>
-    </w:p>
-    <w:p>
-      <w:pPr>
-        <w:rPr>
-          <w:rFonts w:ascii="Old Standard TT" w:hAnsi="Old Standard TT"/>
-        </w:rPr>
-      </w:pPr>
+        </w:rPr>
+        <w:t>I used multiple AI assistants across different aspects of this project. Gemini was used to assist with application development and code generation. Claude was used for project planning, architectural decisions, and drafting sections of this report. ChatGPT was used to generate the Python data processing script. All benchmark results were empirically obtained by running the evaluation pipeline against live APIs, and all claims in this report were independently verified against the observed data.</w:t>
+      </w:r>
     </w:p>
     <w:sectPr>
       <w:pgSz w:w="12240" w:h="15840"/>
@@ -8960,7 +9020,6 @@
     <w:basedOn w:val="Normal"/>
     <w:next w:val="Normal"/>
     <w:uiPriority w:val="9"/>
-    <w:semiHidden/>
     <w:unhideWhenUsed/>
     <w:qFormat/>
     <w:pPr>
@@ -9155,6 +9214,17 @@
       <w:ind w:left="720"/>
       <w:contextualSpacing/>
     </w:pPr>
+  </w:style>
+  <w:style w:type="character" w:styleId="Strong">
+    <w:name w:val="Strong"/>
+    <w:basedOn w:val="DefaultParagraphFont"/>
+    <w:uiPriority w:val="22"/>
+    <w:qFormat/>
+    <w:rsid w:val="004E00D7"/>
+    <w:rPr>
+      <w:b/>
+      <w:bCs/>
+    </w:rPr>
   </w:style>
 </w:styles>
 </file>

</xml_diff>